<commit_message>
Update BNI Fleksi Aktif features: templates, calculation, and form handling
</commit_message>
<xml_diff>
--- a/frontend/templates/template_aktif.docx
+++ b/frontend/templates/template_aktif.docx
@@ -16,8 +16,8 @@
           <w:u w:val="single"/>
         </w:rPr>
       </w:pPr>
-      <w:bookmarkStart w:id="0" w:name="OLE_LINK30"/>
-      <w:bookmarkStart w:id="1" w:name="OLE_LINK2"/>
+      <w:bookmarkStart w:id="0" w:name="OLE_LINK2"/>
+      <w:bookmarkStart w:id="1" w:name="OLE_LINK30"/>
       <w:r>
         <w:rPr>
           <w:rFonts w:ascii="Kalinga" w:hAnsi="Kalinga" w:cs="Kalinga"/>
@@ -777,7 +777,30 @@
           <w:sz w:val="20"/>
           <w:szCs w:val="20"/>
         </w:rPr>
-        <w:t xml:space="preserve">aji Pensiun Bulan {{pensiun_bulan_1_nama}} </w:t>
+        <w:t>aji Bulan {{</w:t>
+      </w:r>
+      <w:r>
+        <w:rPr>
+          <w:rFonts w:hint="default" w:ascii="Kalinga" w:hAnsi="Kalinga"/>
+          <w:b w:val="0"/>
+          <w:bCs w:val="0"/>
+          <w:color w:val="auto"/>
+          <w:sz w:val="20"/>
+          <w:szCs w:val="20"/>
+          <w:lang w:val="en-US"/>
+        </w:rPr>
+        <w:t>gaji_bulan</w:t>
+      </w:r>
+      <w:r>
+        <w:rPr>
+          <w:rFonts w:hint="default" w:ascii="Kalinga" w:hAnsi="Kalinga"/>
+          <w:b w:val="0"/>
+          <w:bCs w:val="0"/>
+          <w:color w:val="auto"/>
+          <w:sz w:val="20"/>
+          <w:szCs w:val="20"/>
+        </w:rPr>
+        <w:t xml:space="preserve">_1_nama}} </w:t>
       </w:r>
       <w:r>
         <w:rPr>
@@ -822,7 +845,30 @@
           <w:sz w:val="20"/>
           <w:szCs w:val="20"/>
         </w:rPr>
-        <w:t>Rp. {{pensiun_bulan_1}},-</w:t>
+        <w:t>Rp. {{</w:t>
+      </w:r>
+      <w:r>
+        <w:rPr>
+          <w:rFonts w:hint="default" w:ascii="Kalinga" w:hAnsi="Kalinga"/>
+          <w:b w:val="0"/>
+          <w:bCs w:val="0"/>
+          <w:color w:val="auto"/>
+          <w:sz w:val="20"/>
+          <w:szCs w:val="20"/>
+          <w:lang w:val="en-US"/>
+        </w:rPr>
+        <w:t>gaji_bulan</w:t>
+      </w:r>
+      <w:r>
+        <w:rPr>
+          <w:rFonts w:hint="default" w:ascii="Kalinga" w:hAnsi="Kalinga"/>
+          <w:b w:val="0"/>
+          <w:bCs w:val="0"/>
+          <w:color w:val="auto"/>
+          <w:sz w:val="20"/>
+          <w:szCs w:val="20"/>
+        </w:rPr>
+        <w:t>_1}},-</w:t>
       </w:r>
     </w:p>
     <w:p>
@@ -852,7 +898,30 @@
           <w:sz w:val="20"/>
           <w:szCs w:val="20"/>
         </w:rPr>
-        <w:t>Gaji Pensiun Bulan {{pensiun_bulan_</w:t>
+        <w:t>Gaji Bulan {{</w:t>
+      </w:r>
+      <w:r>
+        <w:rPr>
+          <w:rFonts w:hint="default" w:ascii="Kalinga" w:hAnsi="Kalinga"/>
+          <w:b w:val="0"/>
+          <w:bCs w:val="0"/>
+          <w:color w:val="auto"/>
+          <w:sz w:val="20"/>
+          <w:szCs w:val="20"/>
+          <w:lang w:val="en-US"/>
+        </w:rPr>
+        <w:t>gaji_bulan</w:t>
+      </w:r>
+      <w:r>
+        <w:rPr>
+          <w:rFonts w:hint="default" w:ascii="Kalinga" w:hAnsi="Kalinga"/>
+          <w:b w:val="0"/>
+          <w:bCs w:val="0"/>
+          <w:color w:val="auto"/>
+          <w:sz w:val="20"/>
+          <w:szCs w:val="20"/>
+        </w:rPr>
+        <w:t>_</w:t>
       </w:r>
       <w:r>
         <w:rPr>
@@ -920,7 +989,30 @@
           <w:sz w:val="20"/>
           <w:szCs w:val="20"/>
         </w:rPr>
-        <w:t>Rp. {{pensiun_bulan_</w:t>
+        <w:t>Rp. {{</w:t>
+      </w:r>
+      <w:r>
+        <w:rPr>
+          <w:rFonts w:hint="default" w:ascii="Kalinga" w:hAnsi="Kalinga"/>
+          <w:b w:val="0"/>
+          <w:bCs w:val="0"/>
+          <w:color w:val="auto"/>
+          <w:sz w:val="20"/>
+          <w:szCs w:val="20"/>
+          <w:lang w:val="en-US"/>
+        </w:rPr>
+        <w:t>gaji_bulan</w:t>
+      </w:r>
+      <w:r>
+        <w:rPr>
+          <w:rFonts w:hint="default" w:ascii="Kalinga" w:hAnsi="Kalinga"/>
+          <w:b w:val="0"/>
+          <w:bCs w:val="0"/>
+          <w:color w:val="auto"/>
+          <w:sz w:val="20"/>
+          <w:szCs w:val="20"/>
+        </w:rPr>
+        <w:t>_</w:t>
       </w:r>
       <w:r>
         <w:rPr>
@@ -982,7 +1074,26 @@
           <w:sz w:val="20"/>
           <w:szCs w:val="20"/>
         </w:rPr>
-        <w:t>ji Pensiun Bulan {{pensiun_bulan_</w:t>
+        <w:t>ji Bulan {{</w:t>
+      </w:r>
+      <w:r>
+        <w:rPr>
+          <w:rFonts w:hint="default" w:ascii="Kalinga" w:hAnsi="Kalinga"/>
+          <w:color w:val="auto"/>
+          <w:sz w:val="20"/>
+          <w:szCs w:val="20"/>
+          <w:lang w:val="en-US"/>
+        </w:rPr>
+        <w:t>gaji_bulan</w:t>
+      </w:r>
+      <w:r>
+        <w:rPr>
+          <w:rFonts w:hint="default" w:ascii="Kalinga" w:hAnsi="Kalinga"/>
+          <w:color w:val="auto"/>
+          <w:sz w:val="20"/>
+          <w:szCs w:val="20"/>
+        </w:rPr>
+        <w:t>_</w:t>
       </w:r>
       <w:r>
         <w:rPr>
@@ -1038,7 +1149,26 @@
           <w:sz w:val="20"/>
           <w:szCs w:val="20"/>
         </w:rPr>
-        <w:t>Rp. {{pensiun_bulan_</w:t>
+        <w:t>Rp. {{</w:t>
+      </w:r>
+      <w:r>
+        <w:rPr>
+          <w:rFonts w:hint="default" w:ascii="Kalinga" w:hAnsi="Kalinga"/>
+          <w:color w:val="auto"/>
+          <w:sz w:val="20"/>
+          <w:szCs w:val="20"/>
+          <w:lang w:val="en-US"/>
+        </w:rPr>
+        <w:t>gaji_bulan</w:t>
+      </w:r>
+      <w:r>
+        <w:rPr>
+          <w:rFonts w:hint="default" w:ascii="Kalinga" w:hAnsi="Kalinga"/>
+          <w:color w:val="auto"/>
+          <w:sz w:val="20"/>
+          <w:szCs w:val="20"/>
+        </w:rPr>
+        <w:t>_</w:t>
       </w:r>
       <w:r>
         <w:rPr>
@@ -1078,69 +1208,92 @@
     <w:p>
       <w:pPr>
         <w:spacing w:after="0" w:line="240" w:lineRule="auto"/>
-        <w:ind w:left="0" w:leftChars="0" w:firstLine="0" w:firstLineChars="0"/>
-        <w:rPr>
-          <w:rFonts w:ascii="Kalinga" w:hAnsi="Kalinga" w:cs="Kalinga"/>
-          <w:b/>
-          <w:bCs/>
-          <w:color w:val="auto"/>
-          <w:sz w:val="20"/>
-          <w:szCs w:val="20"/>
-        </w:rPr>
-      </w:pPr>
-      <w:r>
-        <w:rPr>
-          <w:rFonts w:ascii="Kalinga" w:hAnsi="Kalinga" w:cs="Kalinga"/>
-          <w:b/>
-          <w:bCs/>
-          <w:color w:val="auto"/>
+        <w:jc w:val="both"/>
+        <w:rPr>
+          <w:rFonts w:hint="default" w:ascii="Kalinga" w:hAnsi="Kalinga"/>
+          <w:b/>
+          <w:bCs/>
           <w:sz w:val="20"/>
           <w:szCs w:val="20"/>
           <w:u w:val="single"/>
-        </w:rPr>
-        <w:t>CALL MEMO</w:t>
-      </w:r>
-    </w:p>
-    <w:p>
-      <w:pPr>
-        <w:spacing w:after="0" w:line="240" w:lineRule="auto"/>
-        <w:ind w:left="0" w:leftChars="0" w:firstLine="0" w:firstLineChars="0"/>
-        <w:rPr>
-          <w:rFonts w:hint="default" w:ascii="Kalinga" w:hAnsi="Kalinga"/>
-          <w:b/>
-          <w:bCs/>
-          <w:color w:val="auto"/>
-          <w:sz w:val="20"/>
-          <w:szCs w:val="20"/>
-          <w:lang w:val="en-US"/>
-        </w:rPr>
-      </w:pPr>
-      <w:r>
-        <w:rPr>
-          <w:rFonts w:hint="default" w:ascii="Kalinga" w:hAnsi="Kalinga"/>
-          <w:b/>
-          <w:bCs/>
-          <w:color w:val="auto"/>
-          <w:sz w:val="20"/>
-          <w:szCs w:val="20"/>
-        </w:rPr>
-        <w:t xml:space="preserve">Tgl. Call Memo   </w:t>
-      </w:r>
-      <w:r>
-        <w:rPr>
-          <w:rFonts w:hint="default" w:ascii="Kalinga" w:hAnsi="Kalinga"/>
-          <w:b/>
-          <w:bCs/>
-          <w:color w:val="auto"/>
-          <w:sz w:val="20"/>
-          <w:szCs w:val="20"/>
-          <w:lang w:val="en-US"/>
-        </w:rPr>
-        <w:tab/>
-      </w:r>
-      <w:r>
-        <w:rPr>
-          <w:rFonts w:hint="default" w:ascii="Kalinga" w:hAnsi="Kalinga"/>
+          <w:lang w:val="en-US"/>
+        </w:rPr>
+      </w:pPr>
+      <w:r>
+        <w:rPr>
+          <w:rFonts w:hint="default" w:ascii="Kalinga" w:hAnsi="Kalinga"/>
+          <w:b/>
+          <w:bCs/>
+          <w:sz w:val="20"/>
+          <w:szCs w:val="20"/>
+          <w:u w:val="single"/>
+          <w:lang w:val="en-US"/>
+        </w:rPr>
+        <w:t>Verifikasi Pihak Ketiga</w:t>
+      </w:r>
+    </w:p>
+    <w:p>
+      <w:pPr>
+        <w:spacing w:after="0" w:line="240" w:lineRule="auto"/>
+        <w:jc w:val="both"/>
+        <w:rPr>
+          <w:rFonts w:hint="default" w:ascii="Kalinga" w:hAnsi="Kalinga" w:cs="Kalinga"/>
+          <w:b/>
+          <w:bCs/>
+          <w:color w:val="auto"/>
+          <w:sz w:val="20"/>
+          <w:szCs w:val="20"/>
+          <w:lang w:val="en-US"/>
+        </w:rPr>
+      </w:pPr>
+      <w:bookmarkStart w:id="3" w:name="OLE_LINK18"/>
+      <w:bookmarkStart w:id="4" w:name="OLE_LINK9"/>
+      <w:r>
+        <w:rPr>
+          <w:rFonts w:hint="default" w:ascii="Kalinga" w:hAnsi="Kalinga"/>
+          <w:b/>
+          <w:bCs/>
+          <w:sz w:val="20"/>
+          <w:szCs w:val="20"/>
+        </w:rPr>
+        <w:t>Tg</w:t>
+      </w:r>
+      <w:r>
+        <w:rPr>
+          <w:rFonts w:hint="default" w:ascii="Kalinga" w:hAnsi="Kalinga" w:cs="Kalinga"/>
+          <w:b/>
+          <w:bCs/>
+          <w:color w:val="auto"/>
+          <w:sz w:val="20"/>
+          <w:szCs w:val="20"/>
+        </w:rPr>
+        <w:t xml:space="preserve">l. Call Memo </w:t>
+      </w:r>
+      <w:r>
+        <w:rPr>
+          <w:rFonts w:hint="default" w:ascii="Kalinga" w:hAnsi="Kalinga" w:cs="Kalinga"/>
+          <w:b/>
+          <w:bCs/>
+          <w:color w:val="auto"/>
+          <w:sz w:val="20"/>
+          <w:szCs w:val="20"/>
+        </w:rPr>
+        <w:tab/>
+      </w:r>
+      <w:r>
+        <w:rPr>
+          <w:rFonts w:hint="default" w:ascii="Kalinga" w:hAnsi="Kalinga" w:cs="Kalinga"/>
+          <w:b/>
+          <w:bCs/>
+          <w:color w:val="auto"/>
+          <w:sz w:val="20"/>
+          <w:szCs w:val="20"/>
+        </w:rPr>
+        <w:tab/>
+      </w:r>
+      <w:r>
+        <w:rPr>
+          <w:rFonts w:hint="default" w:ascii="Kalinga" w:hAnsi="Kalinga" w:cs="Kalinga"/>
           <w:b/>
           <w:bCs/>
           <w:color w:val="auto"/>
@@ -1151,139 +1304,251 @@
       </w:r>
       <w:r>
         <w:rPr>
-          <w:rFonts w:hint="default" w:ascii="Kalinga" w:hAnsi="Kalinga"/>
-          <w:b/>
-          <w:bCs/>
-          <w:color w:val="auto"/>
-          <w:sz w:val="20"/>
-          <w:szCs w:val="20"/>
-          <w:lang w:val="en-US"/>
-        </w:rPr>
-        <w:t>{{tgl_call_memo}}</w:t>
-      </w:r>
-    </w:p>
-    <w:p>
-      <w:pPr>
-        <w:spacing w:after="0" w:line="240" w:lineRule="auto"/>
-        <w:ind w:left="0" w:leftChars="0" w:firstLine="0" w:firstLineChars="0"/>
-        <w:rPr>
-          <w:rFonts w:hint="default" w:ascii="Kalinga" w:hAnsi="Kalinga"/>
-          <w:b/>
-          <w:bCs/>
-          <w:color w:val="auto"/>
-          <w:sz w:val="20"/>
-          <w:szCs w:val="20"/>
-        </w:rPr>
-      </w:pPr>
-      <w:r>
-        <w:rPr>
-          <w:rFonts w:hint="default" w:ascii="Kalinga" w:hAnsi="Kalinga"/>
-          <w:b/>
-          <w:bCs/>
-          <w:color w:val="auto"/>
-          <w:sz w:val="20"/>
-          <w:szCs w:val="20"/>
-        </w:rPr>
-        <w:t xml:space="preserve">Yang diverifikasi   </w:t>
-      </w:r>
-      <w:r>
-        <w:rPr>
-          <w:rFonts w:hint="default" w:ascii="Kalinga" w:hAnsi="Kalinga"/>
-          <w:b/>
-          <w:bCs/>
-          <w:color w:val="auto"/>
-          <w:sz w:val="20"/>
-          <w:szCs w:val="20"/>
-          <w:lang w:val="en-US"/>
-        </w:rPr>
-        <w:tab/>
-      </w:r>
-      <w:r>
-        <w:rPr>
-          <w:rFonts w:hint="default" w:ascii="Kalinga" w:hAnsi="Kalinga"/>
-          <w:b/>
-          <w:bCs/>
-          <w:color w:val="auto"/>
-          <w:sz w:val="20"/>
-          <w:szCs w:val="20"/>
-        </w:rPr>
-        <w:t>: {{nama_kerabat}} ({{hubungan_kerabat}})</w:t>
-      </w:r>
-    </w:p>
-    <w:p>
-      <w:pPr>
-        <w:spacing w:after="0" w:line="240" w:lineRule="auto"/>
-        <w:ind w:left="0" w:leftChars="0" w:firstLine="0" w:firstLineChars="0"/>
-        <w:rPr>
-          <w:rFonts w:hint="default" w:ascii="Kalinga" w:hAnsi="Kalinga"/>
-          <w:b/>
-          <w:bCs/>
-          <w:color w:val="auto"/>
-          <w:sz w:val="20"/>
-          <w:szCs w:val="20"/>
-        </w:rPr>
-      </w:pPr>
-      <w:r>
-        <w:rPr>
-          <w:rFonts w:hint="default" w:ascii="Kalinga" w:hAnsi="Kalinga"/>
-          <w:b/>
-          <w:bCs/>
-          <w:color w:val="auto"/>
-          <w:sz w:val="20"/>
-          <w:szCs w:val="20"/>
-        </w:rPr>
-        <w:t xml:space="preserve">Bentuk Call   </w:t>
-      </w:r>
-      <w:r>
-        <w:rPr>
-          <w:rFonts w:hint="default" w:ascii="Kalinga" w:hAnsi="Kalinga"/>
-          <w:b/>
-          <w:bCs/>
-          <w:color w:val="auto"/>
-          <w:sz w:val="20"/>
-          <w:szCs w:val="20"/>
-          <w:lang w:val="en-US"/>
-        </w:rPr>
-        <w:tab/>
-      </w:r>
-      <w:r>
-        <w:rPr>
-          <w:rFonts w:hint="default" w:ascii="Kalinga" w:hAnsi="Kalinga"/>
-          <w:b/>
-          <w:bCs/>
-          <w:color w:val="auto"/>
-          <w:sz w:val="20"/>
-          <w:szCs w:val="20"/>
-          <w:lang w:val="en-US"/>
-        </w:rPr>
-        <w:tab/>
-      </w:r>
-      <w:r>
-        <w:rPr>
-          <w:rFonts w:hint="default" w:ascii="Kalinga" w:hAnsi="Kalinga"/>
-          <w:b/>
-          <w:bCs/>
-          <w:color w:val="auto"/>
-          <w:sz w:val="20"/>
-          <w:szCs w:val="20"/>
-        </w:rPr>
-        <w:t>: Wawancara via Telepon ({{no_telepon_kerabat}}</w:t>
-      </w:r>
-      <w:r>
-        <w:rPr>
-          <w:rFonts w:hint="default" w:ascii="Kalinga" w:hAnsi="Kalinga"/>
-          <w:b/>
-          <w:bCs/>
-          <w:color w:val="auto"/>
-          <w:sz w:val="20"/>
-          <w:szCs w:val="20"/>
-          <w:lang w:val="en-US"/>
-        </w:rPr>
-        <w:tab/>
-      </w:r>
-      <w:r>
-        <w:rPr>
-          <w:rFonts w:hint="default" w:ascii="Kalinga" w:hAnsi="Kalinga"/>
+          <w:rFonts w:hint="default" w:ascii="Kalinga" w:hAnsi="Kalinga" w:cs="Kalinga"/>
+          <w:b/>
+          <w:bCs/>
+          <w:color w:val="auto"/>
+          <w:sz w:val="20"/>
+          <w:szCs w:val="20"/>
+          <w:lang w:val="en-US"/>
+        </w:rPr>
+        <w:t>{{</w:t>
+      </w:r>
+      <w:r>
+        <w:rPr>
+          <w:rFonts w:hint="default" w:ascii="Kalinga" w:hAnsi="Kalinga" w:cs="Kalinga"/>
+          <w:b/>
+          <w:bCs/>
+          <w:color w:val="auto"/>
+          <w:sz w:val="20"/>
+          <w:szCs w:val="20"/>
+        </w:rPr>
+        <w:t>tgl_call_memo</w:t>
+      </w:r>
+      <w:r>
+        <w:rPr>
+          <w:rFonts w:hint="default" w:ascii="Kalinga" w:hAnsi="Kalinga" w:cs="Kalinga"/>
+          <w:b/>
+          <w:bCs/>
+          <w:color w:val="auto"/>
+          <w:sz w:val="20"/>
+          <w:szCs w:val="20"/>
+          <w:lang w:val="en-US"/>
+        </w:rPr>
+        <w:t>}}</w:t>
+      </w:r>
+    </w:p>
+    <w:p>
+      <w:pPr>
+        <w:spacing w:after="0" w:line="240" w:lineRule="auto"/>
+        <w:jc w:val="both"/>
+        <w:rPr>
+          <w:rFonts w:hint="default" w:ascii="Kalinga" w:hAnsi="Kalinga" w:cs="Kalinga"/>
+          <w:b/>
+          <w:bCs/>
+          <w:color w:val="auto"/>
+          <w:sz w:val="20"/>
+          <w:szCs w:val="20"/>
+        </w:rPr>
+      </w:pPr>
+      <w:r>
+        <w:rPr>
+          <w:rFonts w:hint="default" w:ascii="Kalinga" w:hAnsi="Kalinga" w:cs="Kalinga"/>
+          <w:b/>
+          <w:bCs/>
+          <w:color w:val="auto"/>
+          <w:sz w:val="20"/>
+          <w:szCs w:val="20"/>
+        </w:rPr>
+        <w:t xml:space="preserve">Yang diverifikasi </w:t>
+      </w:r>
+      <w:r>
+        <w:rPr>
+          <w:rFonts w:hint="default" w:ascii="Kalinga" w:hAnsi="Kalinga" w:cs="Kalinga"/>
+          <w:b/>
+          <w:bCs/>
+          <w:color w:val="auto"/>
+          <w:sz w:val="20"/>
+          <w:szCs w:val="20"/>
+        </w:rPr>
+        <w:tab/>
+      </w:r>
+      <w:r>
+        <w:rPr>
+          <w:rFonts w:hint="default" w:ascii="Kalinga" w:hAnsi="Kalinga" w:cs="Kalinga"/>
+          <w:b/>
+          <w:bCs/>
+          <w:color w:val="auto"/>
+          <w:sz w:val="20"/>
+          <w:szCs w:val="20"/>
+        </w:rPr>
+        <w:t xml:space="preserve">: </w:t>
+      </w:r>
+      <w:r>
+        <w:rPr>
+          <w:rFonts w:hint="default" w:ascii="Kalinga" w:hAnsi="Kalinga" w:cs="Kalinga"/>
+          <w:b/>
+          <w:bCs/>
+          <w:color w:val="auto"/>
+          <w:sz w:val="20"/>
+          <w:szCs w:val="20"/>
+          <w:lang w:val="en-US"/>
+        </w:rPr>
+        <w:t>{{</w:t>
+      </w:r>
+      <w:r>
+        <w:rPr>
+          <w:rFonts w:hint="default" w:ascii="Kalinga" w:hAnsi="Kalinga" w:cs="Kalinga"/>
+          <w:b/>
+          <w:bCs/>
+          <w:color w:val="auto"/>
+          <w:sz w:val="20"/>
+          <w:szCs w:val="20"/>
+        </w:rPr>
+        <w:t>nama_bendahara</w:t>
+      </w:r>
+      <w:r>
+        <w:rPr>
+          <w:rFonts w:hint="default" w:ascii="Kalinga" w:hAnsi="Kalinga" w:cs="Kalinga"/>
+          <w:b/>
+          <w:bCs/>
+          <w:color w:val="auto"/>
+          <w:sz w:val="20"/>
+          <w:szCs w:val="20"/>
+          <w:lang w:val="en-US"/>
+        </w:rPr>
+        <w:t>}}</w:t>
+      </w:r>
+      <w:r>
+        <w:rPr>
+          <w:rFonts w:hint="default" w:ascii="Kalinga" w:hAnsi="Kalinga" w:cs="Kalinga"/>
+          <w:b/>
+          <w:bCs/>
+          <w:color w:val="auto"/>
+          <w:sz w:val="20"/>
+          <w:szCs w:val="20"/>
+        </w:rPr>
+        <w:t xml:space="preserve"> (Bendahara)</w:t>
+      </w:r>
+    </w:p>
+    <w:p>
+      <w:pPr>
+        <w:spacing w:after="0" w:line="240" w:lineRule="auto"/>
+        <w:jc w:val="both"/>
+        <w:rPr>
+          <w:rFonts w:hint="default" w:ascii="Kalinga" w:hAnsi="Kalinga" w:cs="Kalinga"/>
+          <w:b/>
+          <w:bCs/>
+          <w:color w:val="auto"/>
+          <w:sz w:val="20"/>
+          <w:szCs w:val="20"/>
+        </w:rPr>
+      </w:pPr>
+      <w:r>
+        <w:rPr>
+          <w:rFonts w:hint="default" w:ascii="Kalinga" w:hAnsi="Kalinga" w:cs="Kalinga"/>
+          <w:b/>
+          <w:bCs/>
+          <w:color w:val="auto"/>
+          <w:sz w:val="20"/>
+          <w:szCs w:val="20"/>
+        </w:rPr>
+        <w:t xml:space="preserve">Bentuk Call </w:t>
+      </w:r>
+      <w:r>
+        <w:rPr>
+          <w:rFonts w:hint="default" w:ascii="Kalinga" w:hAnsi="Kalinga" w:cs="Kalinga"/>
+          <w:b/>
+          <w:bCs/>
+          <w:color w:val="auto"/>
+          <w:sz w:val="20"/>
+          <w:szCs w:val="20"/>
+        </w:rPr>
+        <w:tab/>
+      </w:r>
+      <w:r>
+        <w:rPr>
+          <w:rFonts w:hint="default" w:ascii="Kalinga" w:hAnsi="Kalinga" w:cs="Kalinga"/>
+          <w:b/>
+          <w:bCs/>
+          <w:color w:val="auto"/>
+          <w:sz w:val="20"/>
+          <w:szCs w:val="20"/>
+        </w:rPr>
+        <w:tab/>
+      </w:r>
+      <w:r>
+        <w:rPr>
+          <w:rFonts w:hint="default" w:ascii="Kalinga" w:hAnsi="Kalinga" w:cs="Kalinga"/>
+          <w:b/>
+          <w:bCs/>
+          <w:color w:val="auto"/>
+          <w:sz w:val="20"/>
+          <w:szCs w:val="20"/>
+        </w:rPr>
+        <w:t>: Wawancara via Telepon (</w:t>
+      </w:r>
+      <w:r>
+        <w:rPr>
+          <w:rFonts w:hint="default" w:ascii="Kalinga" w:hAnsi="Kalinga" w:cs="Kalinga"/>
+          <w:b/>
+          <w:bCs/>
+          <w:color w:val="auto"/>
+          <w:sz w:val="20"/>
+          <w:szCs w:val="20"/>
+          <w:lang w:val="en-US"/>
+        </w:rPr>
+        <w:t>{{</w:t>
+      </w:r>
+      <w:r>
+        <w:rPr>
+          <w:rFonts w:hint="default" w:ascii="Kalinga" w:hAnsi="Kalinga" w:cs="Kalinga"/>
+          <w:b/>
+          <w:bCs/>
+          <w:color w:val="auto"/>
+          <w:sz w:val="20"/>
+          <w:szCs w:val="20"/>
+        </w:rPr>
+        <w:t>no_</w:t>
+      </w:r>
+      <w:r>
+        <w:rPr>
+          <w:rFonts w:hint="default" w:ascii="Kalinga" w:hAnsi="Kalinga" w:cs="Kalinga"/>
+          <w:b/>
+          <w:bCs/>
+          <w:color w:val="auto"/>
+          <w:sz w:val="20"/>
+          <w:szCs w:val="20"/>
+          <w:lang w:val="en-US"/>
+        </w:rPr>
+        <w:t>hp</w:t>
+      </w:r>
+      <w:r>
+        <w:rPr>
+          <w:rFonts w:hint="default" w:ascii="Kalinga" w:hAnsi="Kalinga" w:cs="Kalinga"/>
+          <w:b/>
+          <w:bCs/>
+          <w:color w:val="auto"/>
+          <w:sz w:val="20"/>
+          <w:szCs w:val="20"/>
+        </w:rPr>
+        <w:t>_bendahara</w:t>
+      </w:r>
+      <w:r>
+        <w:rPr>
+          <w:rFonts w:hint="default" w:ascii="Kalinga" w:hAnsi="Kalinga" w:cs="Kalinga"/>
+          <w:b/>
+          <w:bCs/>
+          <w:color w:val="auto"/>
+          <w:sz w:val="20"/>
+          <w:szCs w:val="20"/>
+          <w:lang w:val="en-US"/>
+        </w:rPr>
+        <w:t>}}</w:t>
+      </w:r>
+      <w:r>
+        <w:rPr>
+          <w:rFonts w:hint="default" w:ascii="Kalinga" w:hAnsi="Kalinga" w:cs="Kalinga"/>
           <w:b/>
           <w:bCs/>
           <w:color w:val="auto"/>
@@ -1296,132 +1561,120 @@
     <w:p>
       <w:pPr>
         <w:spacing w:after="0" w:line="240" w:lineRule="auto"/>
-        <w:ind w:left="0" w:leftChars="0" w:firstLine="0" w:firstLineChars="0"/>
-        <w:rPr>
-          <w:rFonts w:hint="default" w:ascii="Kalinga" w:hAnsi="Kalinga"/>
-          <w:b/>
-          <w:bCs/>
-          <w:color w:val="auto"/>
-          <w:sz w:val="20"/>
-          <w:szCs w:val="20"/>
-        </w:rPr>
-      </w:pPr>
-      <w:r>
-        <w:rPr>
-          <w:rFonts w:hint="default" w:ascii="Kalinga" w:hAnsi="Kalinga"/>
-          <w:b/>
-          <w:bCs/>
-          <w:color w:val="auto"/>
-          <w:sz w:val="20"/>
-          <w:szCs w:val="20"/>
-        </w:rPr>
-        <w:t xml:space="preserve">Tujuan Call   </w:t>
-      </w:r>
-      <w:r>
-        <w:rPr>
-          <w:rFonts w:hint="default" w:ascii="Kalinga" w:hAnsi="Kalinga"/>
-          <w:b/>
-          <w:bCs/>
-          <w:color w:val="auto"/>
-          <w:sz w:val="20"/>
-          <w:szCs w:val="20"/>
-          <w:lang w:val="en-US"/>
-        </w:rPr>
-        <w:tab/>
-      </w:r>
-      <w:r>
-        <w:rPr>
-          <w:rFonts w:hint="default" w:ascii="Kalinga" w:hAnsi="Kalinga"/>
-          <w:b/>
-          <w:bCs/>
-          <w:color w:val="auto"/>
-          <w:sz w:val="20"/>
-          <w:szCs w:val="20"/>
-          <w:lang w:val="en-US"/>
-        </w:rPr>
-        <w:tab/>
-      </w:r>
-      <w:r>
-        <w:rPr>
-          <w:rFonts w:hint="default" w:ascii="Kalinga" w:hAnsi="Kalinga"/>
-          <w:b/>
-          <w:bCs/>
-          <w:color w:val="auto"/>
-          <w:sz w:val="20"/>
-          <w:szCs w:val="20"/>
-        </w:rPr>
-        <w:t>: Konfirmasi Kerabat</w:t>
-      </w:r>
-    </w:p>
-    <w:p>
-      <w:pPr>
-        <w:spacing w:after="0" w:line="240" w:lineRule="auto"/>
-        <w:ind w:left="0" w:leftChars="0" w:firstLine="0" w:firstLineChars="0"/>
-        <w:rPr>
-          <w:rFonts w:ascii="Kalinga" w:hAnsi="Kalinga" w:cs="Kalinga"/>
-          <w:b/>
-          <w:bCs/>
-          <w:color w:val="auto"/>
-          <w:sz w:val="20"/>
-          <w:szCs w:val="20"/>
-        </w:rPr>
-      </w:pPr>
-      <w:r>
-        <w:rPr>
-          <w:rFonts w:ascii="Kalinga" w:hAnsi="Kalinga" w:cs="Kalinga"/>
-          <w:b/>
-          <w:bCs/>
-          <w:color w:val="auto"/>
-          <w:sz w:val="20"/>
-          <w:szCs w:val="20"/>
-        </w:rPr>
-        <w:t xml:space="preserve">Informasi didapat </w:t>
-      </w:r>
-      <w:r>
-        <w:rPr>
-          <w:rFonts w:ascii="Kalinga" w:hAnsi="Kalinga" w:cs="Kalinga"/>
-          <w:b/>
-          <w:bCs/>
-          <w:color w:val="auto"/>
-          <w:sz w:val="20"/>
-          <w:szCs w:val="20"/>
-        </w:rPr>
-        <w:tab/>
-      </w:r>
-      <w:r>
-        <w:rPr>
-          <w:rFonts w:ascii="Kalinga" w:hAnsi="Kalinga" w:cs="Kalinga"/>
-          <w:b/>
-          <w:bCs/>
-          <w:color w:val="auto"/>
-          <w:sz w:val="20"/>
-          <w:szCs w:val="20"/>
-        </w:rPr>
-        <w:t>:</w:t>
-      </w:r>
-    </w:p>
-    <w:p>
-      <w:pPr>
-        <w:spacing w:after="0" w:line="240" w:lineRule="auto"/>
-        <w:rPr>
-          <w:rFonts w:hint="default" w:ascii="Kalinga" w:hAnsi="Kalinga"/>
-          <w:b w:val="0"/>
-          <w:bCs w:val="0"/>
-          <w:color w:val="auto"/>
-          <w:sz w:val="20"/>
-          <w:szCs w:val="20"/>
-        </w:rPr>
-      </w:pPr>
-      <w:r>
-        <w:rPr>
-          <w:rFonts w:hint="default" w:ascii="Kalinga" w:hAnsi="Kalinga"/>
-          <w:b w:val="0"/>
-          <w:bCs w:val="0"/>
-          <w:color w:val="auto"/>
-          <w:sz w:val="20"/>
-          <w:szCs w:val="20"/>
-        </w:rPr>
-        <w:t>{{#list_call_memo}}</w:t>
+        <w:jc w:val="both"/>
+        <w:rPr>
+          <w:rFonts w:hint="default" w:ascii="Kalinga" w:hAnsi="Kalinga" w:cs="Kalinga"/>
+          <w:b/>
+          <w:bCs/>
+          <w:color w:val="auto"/>
+          <w:sz w:val="20"/>
+          <w:szCs w:val="20"/>
+        </w:rPr>
+      </w:pPr>
+      <w:r>
+        <w:rPr>
+          <w:rFonts w:hint="default" w:ascii="Kalinga" w:hAnsi="Kalinga" w:cs="Kalinga"/>
+          <w:b/>
+          <w:bCs/>
+          <w:color w:val="auto"/>
+          <w:sz w:val="20"/>
+          <w:szCs w:val="20"/>
+        </w:rPr>
+        <w:t xml:space="preserve">Tujuan Call </w:t>
+      </w:r>
+      <w:r>
+        <w:rPr>
+          <w:rFonts w:hint="default" w:ascii="Kalinga" w:hAnsi="Kalinga" w:cs="Kalinga"/>
+          <w:b/>
+          <w:bCs/>
+          <w:color w:val="auto"/>
+          <w:sz w:val="20"/>
+          <w:szCs w:val="20"/>
+        </w:rPr>
+        <w:tab/>
+      </w:r>
+      <w:r>
+        <w:rPr>
+          <w:rFonts w:hint="default" w:ascii="Kalinga" w:hAnsi="Kalinga" w:cs="Kalinga"/>
+          <w:b/>
+          <w:bCs/>
+          <w:color w:val="auto"/>
+          <w:sz w:val="20"/>
+          <w:szCs w:val="20"/>
+        </w:rPr>
+        <w:tab/>
+      </w:r>
+      <w:r>
+        <w:rPr>
+          <w:rFonts w:hint="default" w:ascii="Kalinga" w:hAnsi="Kalinga" w:cs="Kalinga"/>
+          <w:b/>
+          <w:bCs/>
+          <w:color w:val="auto"/>
+          <w:sz w:val="20"/>
+          <w:szCs w:val="20"/>
+        </w:rPr>
+        <w:t>: Konfirmasi Gaji Pemohon</w:t>
+      </w:r>
+    </w:p>
+    <w:p>
+      <w:pPr>
+        <w:spacing w:after="0" w:line="240" w:lineRule="auto"/>
+        <w:jc w:val="both"/>
+        <w:rPr>
+          <w:rFonts w:hint="default" w:ascii="Kalinga" w:hAnsi="Kalinga"/>
+          <w:b/>
+          <w:bCs/>
+          <w:sz w:val="20"/>
+          <w:szCs w:val="20"/>
+        </w:rPr>
+      </w:pPr>
+      <w:r>
+        <w:rPr>
+          <w:rFonts w:hint="default" w:ascii="Kalinga" w:hAnsi="Kalinga" w:cs="Kalinga"/>
+          <w:b/>
+          <w:bCs/>
+          <w:color w:val="auto"/>
+          <w:sz w:val="20"/>
+          <w:szCs w:val="20"/>
+        </w:rPr>
+        <w:t>Inform</w:t>
+      </w:r>
+      <w:r>
+        <w:rPr>
+          <w:rFonts w:hint="default" w:ascii="Kalinga" w:hAnsi="Kalinga"/>
+          <w:b/>
+          <w:bCs/>
+          <w:sz w:val="20"/>
+          <w:szCs w:val="20"/>
+        </w:rPr>
+        <w:t>asi yang diberikan:</w:t>
+      </w:r>
+    </w:p>
+    <w:bookmarkEnd w:id="3"/>
+    <w:bookmarkEnd w:id="4"/>
+    <w:p>
+      <w:pPr>
+        <w:spacing w:after="0" w:line="240" w:lineRule="auto"/>
+        <w:jc w:val="both"/>
+        <w:rPr>
+          <w:rFonts w:hint="default" w:ascii="Kalinga" w:hAnsi="Kalinga"/>
+          <w:b w:val="0"/>
+          <w:bCs w:val="0"/>
+          <w:color w:val="auto"/>
+          <w:sz w:val="20"/>
+          <w:szCs w:val="20"/>
+        </w:rPr>
+      </w:pPr>
+      <w:r>
+        <w:rPr>
+          <w:rFonts w:hint="default" w:ascii="Kalinga" w:hAnsi="Kalinga"/>
+          <w:b w:val="0"/>
+          <w:bCs w:val="0"/>
+          <w:color w:val="auto"/>
+          <w:sz w:val="20"/>
+          <w:szCs w:val="20"/>
+        </w:rPr>
+        <w:t>{{#list_verifikasi_bendahara}}</w:t>
       </w:r>
     </w:p>
     <w:p>
@@ -1457,50 +1710,955 @@
     <w:p>
       <w:pPr>
         <w:spacing w:after="0" w:line="240" w:lineRule="auto"/>
-        <w:rPr>
-          <w:rFonts w:hint="default" w:ascii="Kalinga" w:hAnsi="Kalinga"/>
-          <w:b/>
-          <w:bCs/>
-          <w:color w:val="auto"/>
-          <w:sz w:val="20"/>
-          <w:szCs w:val="20"/>
-        </w:rPr>
-      </w:pPr>
-      <w:r>
-        <w:rPr>
-          <w:rFonts w:hint="default" w:ascii="Kalinga" w:hAnsi="Kalinga"/>
-          <w:b w:val="0"/>
-          <w:bCs w:val="0"/>
-          <w:color w:val="auto"/>
-          <w:sz w:val="20"/>
-          <w:szCs w:val="20"/>
-        </w:rPr>
-        <w:t>{{/list_call_memo}}</w:t>
-      </w:r>
-      <w:r>
-        <w:rPr>
-          <w:rFonts w:hint="default" w:ascii="Kalinga" w:hAnsi="Kalinga"/>
-          <w:b/>
-          <w:bCs/>
-          <w:color w:val="auto"/>
-          <w:sz w:val="20"/>
-          <w:szCs w:val="20"/>
-        </w:rPr>
-        <w:br w:type="textWrapping"/>
-      </w:r>
-    </w:p>
-    <w:p>
-      <w:pPr>
-        <w:spacing w:after="0" w:line="240" w:lineRule="auto"/>
-        <w:rPr>
-          <w:rFonts w:hint="default" w:ascii="Kalinga" w:hAnsi="Kalinga"/>
-          <w:b/>
-          <w:bCs/>
-          <w:color w:val="auto"/>
-          <w:sz w:val="20"/>
-          <w:szCs w:val="20"/>
-        </w:rPr>
-      </w:pPr>
+        <w:jc w:val="both"/>
+        <w:rPr>
+          <w:rFonts w:ascii="Kalinga" w:hAnsi="Kalinga" w:cs="Kalinga"/>
+          <w:b w:val="0"/>
+          <w:bCs w:val="0"/>
+          <w:color w:val="auto"/>
+          <w:sz w:val="20"/>
+          <w:szCs w:val="20"/>
+        </w:rPr>
+      </w:pPr>
+      <w:r>
+        <w:rPr>
+          <w:rFonts w:hint="default" w:ascii="Kalinga" w:hAnsi="Kalinga"/>
+          <w:b w:val="0"/>
+          <w:bCs w:val="0"/>
+          <w:color w:val="auto"/>
+          <w:sz w:val="20"/>
+          <w:szCs w:val="20"/>
+        </w:rPr>
+        <w:t>{{/list_verifikasi_bendahara}}</w:t>
+      </w:r>
+    </w:p>
+    <w:p>
+      <w:pPr>
+        <w:spacing w:after="0" w:line="240" w:lineRule="auto"/>
+        <w:jc w:val="both"/>
+        <w:rPr>
+          <w:rFonts w:ascii="Kalinga" w:hAnsi="Kalinga" w:cs="Kalinga"/>
+          <w:b/>
+          <w:bCs/>
+          <w:color w:val="auto"/>
+          <w:sz w:val="20"/>
+          <w:szCs w:val="20"/>
+        </w:rPr>
+      </w:pPr>
+    </w:p>
+    <w:p>
+      <w:pPr>
+        <w:spacing w:after="0" w:line="240" w:lineRule="auto"/>
+        <w:jc w:val="both"/>
+        <w:rPr>
+          <w:rFonts w:hint="default" w:ascii="Kalinga" w:hAnsi="Kalinga" w:cs="Kalinga"/>
+          <w:b/>
+          <w:bCs/>
+          <w:color w:val="auto"/>
+          <w:sz w:val="20"/>
+          <w:szCs w:val="20"/>
+          <w:lang w:val="en-US"/>
+        </w:rPr>
+      </w:pPr>
+      <w:bookmarkStart w:id="5" w:name="OLE_LINK59"/>
+      <w:r>
+        <w:rPr>
+          <w:rFonts w:hint="default" w:ascii="Kalinga" w:hAnsi="Kalinga"/>
+          <w:b/>
+          <w:bCs/>
+          <w:color w:val="auto"/>
+          <w:sz w:val="20"/>
+          <w:szCs w:val="20"/>
+        </w:rPr>
+        <w:t>T</w:t>
+      </w:r>
+      <w:r>
+        <w:rPr>
+          <w:rFonts w:hint="default" w:ascii="Kalinga" w:hAnsi="Kalinga" w:cs="Kalinga"/>
+          <w:b/>
+          <w:bCs/>
+          <w:color w:val="auto"/>
+          <w:sz w:val="20"/>
+          <w:szCs w:val="20"/>
+        </w:rPr>
+        <w:t xml:space="preserve">gl. Call Memo </w:t>
+      </w:r>
+      <w:r>
+        <w:rPr>
+          <w:rFonts w:hint="default" w:ascii="Kalinga" w:hAnsi="Kalinga" w:cs="Kalinga"/>
+          <w:b/>
+          <w:bCs/>
+          <w:color w:val="auto"/>
+          <w:sz w:val="20"/>
+          <w:szCs w:val="20"/>
+        </w:rPr>
+        <w:tab/>
+      </w:r>
+      <w:r>
+        <w:rPr>
+          <w:rFonts w:hint="default" w:ascii="Kalinga" w:hAnsi="Kalinga" w:cs="Kalinga"/>
+          <w:b/>
+          <w:bCs/>
+          <w:color w:val="auto"/>
+          <w:sz w:val="20"/>
+          <w:szCs w:val="20"/>
+        </w:rPr>
+        <w:tab/>
+      </w:r>
+      <w:r>
+        <w:rPr>
+          <w:rFonts w:hint="default" w:ascii="Kalinga" w:hAnsi="Kalinga" w:cs="Kalinga"/>
+          <w:b/>
+          <w:bCs/>
+          <w:color w:val="auto"/>
+          <w:sz w:val="20"/>
+          <w:szCs w:val="20"/>
+        </w:rPr>
+        <w:t xml:space="preserve">: </w:t>
+      </w:r>
+      <w:r>
+        <w:rPr>
+          <w:rFonts w:hint="default" w:ascii="Kalinga" w:hAnsi="Kalinga" w:cs="Kalinga"/>
+          <w:b/>
+          <w:bCs/>
+          <w:color w:val="auto"/>
+          <w:sz w:val="20"/>
+          <w:szCs w:val="20"/>
+          <w:lang w:val="en-US"/>
+        </w:rPr>
+        <w:t>{{</w:t>
+      </w:r>
+      <w:r>
+        <w:rPr>
+          <w:rFonts w:hint="default" w:ascii="Kalinga" w:hAnsi="Kalinga" w:cs="Kalinga"/>
+          <w:b/>
+          <w:bCs/>
+          <w:color w:val="auto"/>
+          <w:sz w:val="20"/>
+          <w:szCs w:val="20"/>
+        </w:rPr>
+        <w:t>tgl_call_memo</w:t>
+      </w:r>
+      <w:r>
+        <w:rPr>
+          <w:rFonts w:hint="default" w:ascii="Kalinga" w:hAnsi="Kalinga" w:cs="Kalinga"/>
+          <w:b/>
+          <w:bCs/>
+          <w:color w:val="auto"/>
+          <w:sz w:val="20"/>
+          <w:szCs w:val="20"/>
+          <w:lang w:val="en-US"/>
+        </w:rPr>
+        <w:t>}}</w:t>
+      </w:r>
+    </w:p>
+    <w:p>
+      <w:pPr>
+        <w:spacing w:after="0" w:line="240" w:lineRule="auto"/>
+        <w:jc w:val="both"/>
+        <w:rPr>
+          <w:rFonts w:hint="default" w:ascii="Kalinga" w:hAnsi="Kalinga" w:cs="Kalinga"/>
+          <w:b/>
+          <w:bCs/>
+          <w:color w:val="auto"/>
+          <w:sz w:val="20"/>
+          <w:szCs w:val="20"/>
+        </w:rPr>
+      </w:pPr>
+      <w:r>
+        <w:rPr>
+          <w:rFonts w:hint="default" w:ascii="Kalinga" w:hAnsi="Kalinga" w:cs="Kalinga"/>
+          <w:b/>
+          <w:bCs/>
+          <w:color w:val="auto"/>
+          <w:sz w:val="20"/>
+          <w:szCs w:val="20"/>
+        </w:rPr>
+        <w:t xml:space="preserve">Yang diverifikasi </w:t>
+      </w:r>
+      <w:r>
+        <w:rPr>
+          <w:rFonts w:hint="default" w:ascii="Kalinga" w:hAnsi="Kalinga" w:cs="Kalinga"/>
+          <w:b/>
+          <w:bCs/>
+          <w:color w:val="auto"/>
+          <w:sz w:val="20"/>
+          <w:szCs w:val="20"/>
+        </w:rPr>
+        <w:tab/>
+      </w:r>
+      <w:r>
+        <w:rPr>
+          <w:rFonts w:hint="default" w:ascii="Kalinga" w:hAnsi="Kalinga" w:cs="Kalinga"/>
+          <w:b/>
+          <w:bCs/>
+          <w:color w:val="auto"/>
+          <w:sz w:val="20"/>
+          <w:szCs w:val="20"/>
+        </w:rPr>
+        <w:t xml:space="preserve">: </w:t>
+      </w:r>
+      <w:r>
+        <w:rPr>
+          <w:rFonts w:hint="default" w:ascii="Kalinga" w:hAnsi="Kalinga" w:cs="Kalinga"/>
+          <w:b/>
+          <w:bCs/>
+          <w:color w:val="auto"/>
+          <w:sz w:val="20"/>
+          <w:szCs w:val="20"/>
+          <w:lang w:val="en-US"/>
+        </w:rPr>
+        <w:t>{{</w:t>
+      </w:r>
+      <w:r>
+        <w:rPr>
+          <w:rFonts w:hint="default" w:ascii="Kalinga" w:hAnsi="Kalinga" w:cs="Kalinga"/>
+          <w:b/>
+          <w:bCs/>
+          <w:color w:val="auto"/>
+          <w:sz w:val="20"/>
+          <w:szCs w:val="20"/>
+        </w:rPr>
+        <w:t>nama_rekan_kerja</w:t>
+      </w:r>
+      <w:r>
+        <w:rPr>
+          <w:rFonts w:hint="default" w:ascii="Kalinga" w:hAnsi="Kalinga" w:cs="Kalinga"/>
+          <w:b/>
+          <w:bCs/>
+          <w:color w:val="auto"/>
+          <w:sz w:val="20"/>
+          <w:szCs w:val="20"/>
+          <w:lang w:val="en-US"/>
+        </w:rPr>
+        <w:t>}}</w:t>
+      </w:r>
+      <w:r>
+        <w:rPr>
+          <w:rFonts w:hint="default" w:ascii="Kalinga" w:hAnsi="Kalinga" w:cs="Kalinga"/>
+          <w:b/>
+          <w:bCs/>
+          <w:color w:val="auto"/>
+          <w:sz w:val="20"/>
+          <w:szCs w:val="20"/>
+        </w:rPr>
+        <w:t xml:space="preserve"> (Rekan Kerja)</w:t>
+      </w:r>
+    </w:p>
+    <w:p>
+      <w:pPr>
+        <w:spacing w:after="0" w:line="240" w:lineRule="auto"/>
+        <w:jc w:val="both"/>
+        <w:rPr>
+          <w:rFonts w:hint="default" w:ascii="Kalinga" w:hAnsi="Kalinga" w:cs="Kalinga"/>
+          <w:b/>
+          <w:bCs/>
+          <w:color w:val="auto"/>
+          <w:sz w:val="20"/>
+          <w:szCs w:val="20"/>
+        </w:rPr>
+      </w:pPr>
+      <w:r>
+        <w:rPr>
+          <w:rFonts w:hint="default" w:ascii="Kalinga" w:hAnsi="Kalinga" w:cs="Kalinga"/>
+          <w:b/>
+          <w:bCs/>
+          <w:color w:val="auto"/>
+          <w:sz w:val="20"/>
+          <w:szCs w:val="20"/>
+        </w:rPr>
+        <w:t xml:space="preserve">Bentuk Call </w:t>
+      </w:r>
+      <w:r>
+        <w:rPr>
+          <w:rFonts w:hint="default" w:ascii="Kalinga" w:hAnsi="Kalinga" w:cs="Kalinga"/>
+          <w:b/>
+          <w:bCs/>
+          <w:color w:val="auto"/>
+          <w:sz w:val="20"/>
+          <w:szCs w:val="20"/>
+        </w:rPr>
+        <w:tab/>
+      </w:r>
+      <w:r>
+        <w:rPr>
+          <w:rFonts w:hint="default" w:ascii="Kalinga" w:hAnsi="Kalinga" w:cs="Kalinga"/>
+          <w:b/>
+          <w:bCs/>
+          <w:color w:val="auto"/>
+          <w:sz w:val="20"/>
+          <w:szCs w:val="20"/>
+        </w:rPr>
+        <w:tab/>
+      </w:r>
+      <w:r>
+        <w:rPr>
+          <w:rFonts w:hint="default" w:ascii="Kalinga" w:hAnsi="Kalinga" w:cs="Kalinga"/>
+          <w:b/>
+          <w:bCs/>
+          <w:color w:val="auto"/>
+          <w:sz w:val="20"/>
+          <w:szCs w:val="20"/>
+        </w:rPr>
+        <w:t>: Wawancara via Telepon (</w:t>
+      </w:r>
+      <w:r>
+        <w:rPr>
+          <w:rFonts w:hint="default" w:ascii="Kalinga" w:hAnsi="Kalinga" w:cs="Kalinga"/>
+          <w:b/>
+          <w:bCs/>
+          <w:color w:val="auto"/>
+          <w:sz w:val="20"/>
+          <w:szCs w:val="20"/>
+          <w:lang w:val="en-US"/>
+        </w:rPr>
+        <w:t>{{</w:t>
+      </w:r>
+      <w:r>
+        <w:rPr>
+          <w:rFonts w:hint="default" w:ascii="Kalinga" w:hAnsi="Kalinga" w:cs="Kalinga"/>
+          <w:b/>
+          <w:bCs/>
+          <w:color w:val="auto"/>
+          <w:sz w:val="20"/>
+          <w:szCs w:val="20"/>
+        </w:rPr>
+        <w:t>no_</w:t>
+      </w:r>
+      <w:r>
+        <w:rPr>
+          <w:rFonts w:hint="default" w:ascii="Kalinga" w:hAnsi="Kalinga" w:cs="Kalinga"/>
+          <w:b/>
+          <w:bCs/>
+          <w:color w:val="auto"/>
+          <w:sz w:val="20"/>
+          <w:szCs w:val="20"/>
+          <w:lang w:val="en-US"/>
+        </w:rPr>
+        <w:t>hp</w:t>
+      </w:r>
+      <w:r>
+        <w:rPr>
+          <w:rFonts w:hint="default" w:ascii="Kalinga" w:hAnsi="Kalinga" w:cs="Kalinga"/>
+          <w:b/>
+          <w:bCs/>
+          <w:color w:val="auto"/>
+          <w:sz w:val="20"/>
+          <w:szCs w:val="20"/>
+        </w:rPr>
+        <w:t>_rekan_kerja</w:t>
+      </w:r>
+      <w:r>
+        <w:rPr>
+          <w:rFonts w:hint="default" w:ascii="Kalinga" w:hAnsi="Kalinga" w:cs="Kalinga"/>
+          <w:b/>
+          <w:bCs/>
+          <w:color w:val="auto"/>
+          <w:sz w:val="20"/>
+          <w:szCs w:val="20"/>
+          <w:lang w:val="en-US"/>
+        </w:rPr>
+        <w:t>}}</w:t>
+      </w:r>
+      <w:r>
+        <w:rPr>
+          <w:rFonts w:hint="default" w:ascii="Kalinga" w:hAnsi="Kalinga" w:cs="Kalinga"/>
+          <w:b/>
+          <w:bCs/>
+          <w:color w:val="auto"/>
+          <w:sz w:val="20"/>
+          <w:szCs w:val="20"/>
+        </w:rPr>
+        <w:t>)</w:t>
+      </w:r>
+    </w:p>
+    <w:p>
+      <w:pPr>
+        <w:spacing w:after="0" w:line="240" w:lineRule="auto"/>
+        <w:jc w:val="both"/>
+        <w:rPr>
+          <w:rFonts w:hint="default" w:ascii="Kalinga" w:hAnsi="Kalinga" w:cs="Kalinga"/>
+          <w:b/>
+          <w:bCs/>
+          <w:color w:val="auto"/>
+          <w:sz w:val="20"/>
+          <w:szCs w:val="20"/>
+        </w:rPr>
+      </w:pPr>
+      <w:r>
+        <w:rPr>
+          <w:rFonts w:hint="default" w:ascii="Kalinga" w:hAnsi="Kalinga" w:cs="Kalinga"/>
+          <w:b/>
+          <w:bCs/>
+          <w:color w:val="auto"/>
+          <w:sz w:val="20"/>
+          <w:szCs w:val="20"/>
+        </w:rPr>
+        <w:t xml:space="preserve">Tujuan Call </w:t>
+      </w:r>
+      <w:r>
+        <w:rPr>
+          <w:rFonts w:hint="default" w:ascii="Kalinga" w:hAnsi="Kalinga" w:cs="Kalinga"/>
+          <w:b/>
+          <w:bCs/>
+          <w:color w:val="auto"/>
+          <w:sz w:val="20"/>
+          <w:szCs w:val="20"/>
+        </w:rPr>
+        <w:tab/>
+      </w:r>
+      <w:r>
+        <w:rPr>
+          <w:rFonts w:hint="default" w:ascii="Kalinga" w:hAnsi="Kalinga" w:cs="Kalinga"/>
+          <w:b/>
+          <w:bCs/>
+          <w:color w:val="auto"/>
+          <w:sz w:val="20"/>
+          <w:szCs w:val="20"/>
+        </w:rPr>
+        <w:tab/>
+      </w:r>
+      <w:r>
+        <w:rPr>
+          <w:rFonts w:hint="default" w:ascii="Kalinga" w:hAnsi="Kalinga" w:cs="Kalinga"/>
+          <w:b/>
+          <w:bCs/>
+          <w:color w:val="auto"/>
+          <w:sz w:val="20"/>
+          <w:szCs w:val="20"/>
+        </w:rPr>
+        <w:t>: Konfirmasi Gaji Pemohon</w:t>
+      </w:r>
+    </w:p>
+    <w:p>
+      <w:pPr>
+        <w:spacing w:after="0" w:line="240" w:lineRule="auto"/>
+        <w:jc w:val="both"/>
+        <w:rPr>
+          <w:rFonts w:hint="default" w:ascii="Kalinga" w:hAnsi="Kalinga" w:cs="Kalinga"/>
+          <w:color w:val="auto"/>
+          <w:sz w:val="20"/>
+          <w:szCs w:val="20"/>
+          <w:lang w:val="en-US"/>
+        </w:rPr>
+      </w:pPr>
+      <w:r>
+        <w:rPr>
+          <w:rFonts w:hint="default" w:ascii="Kalinga" w:hAnsi="Kalinga" w:cs="Kalinga"/>
+          <w:b/>
+          <w:bCs/>
+          <w:color w:val="auto"/>
+          <w:sz w:val="20"/>
+          <w:szCs w:val="20"/>
+        </w:rPr>
+        <w:t>Informa</w:t>
+      </w:r>
+      <w:r>
+        <w:rPr>
+          <w:rFonts w:hint="default" w:ascii="Kalinga" w:hAnsi="Kalinga"/>
+          <w:b/>
+          <w:bCs/>
+          <w:color w:val="auto"/>
+          <w:sz w:val="20"/>
+          <w:szCs w:val="20"/>
+        </w:rPr>
+        <w:t>si yang diberikan</w:t>
+      </w:r>
+      <w:r>
+        <w:rPr>
+          <w:rFonts w:hint="default" w:ascii="Kalinga" w:hAnsi="Kalinga"/>
+          <w:b/>
+          <w:bCs/>
+          <w:color w:val="auto"/>
+          <w:sz w:val="20"/>
+          <w:szCs w:val="20"/>
+        </w:rPr>
+        <w:tab/>
+      </w:r>
+      <w:r>
+        <w:rPr>
+          <w:rFonts w:hint="default" w:ascii="Kalinga" w:hAnsi="Kalinga"/>
+          <w:b/>
+          <w:bCs/>
+          <w:color w:val="auto"/>
+          <w:sz w:val="20"/>
+          <w:szCs w:val="20"/>
+        </w:rPr>
+        <w:t>:</w:t>
+      </w:r>
+    </w:p>
+    <w:bookmarkEnd w:id="5"/>
+    <w:p>
+      <w:pPr>
+        <w:spacing w:after="0" w:line="240" w:lineRule="auto"/>
+        <w:jc w:val="both"/>
+        <w:rPr>
+          <w:rFonts w:hint="default" w:ascii="Kalinga" w:hAnsi="Kalinga"/>
+          <w:b w:val="0"/>
+          <w:bCs w:val="0"/>
+          <w:sz w:val="20"/>
+          <w:szCs w:val="20"/>
+        </w:rPr>
+      </w:pPr>
+      <w:r>
+        <w:rPr>
+          <w:rFonts w:hint="default" w:ascii="Kalinga" w:hAnsi="Kalinga"/>
+          <w:b w:val="0"/>
+          <w:bCs w:val="0"/>
+          <w:sz w:val="20"/>
+          <w:szCs w:val="20"/>
+        </w:rPr>
+        <w:t>{{#list_verifikasi_rekan_kerja}}</w:t>
+      </w:r>
+    </w:p>
+    <w:p>
+      <w:pPr>
+        <w:numPr>
+          <w:ilvl w:val="0"/>
+          <w:numId w:val="1"/>
+        </w:numPr>
+        <w:spacing w:after="0" w:line="240" w:lineRule="auto"/>
+        <w:ind w:left="440" w:leftChars="0" w:hanging="360" w:firstLineChars="0"/>
+        <w:jc w:val="both"/>
+        <w:rPr>
+          <w:rFonts w:hint="default" w:ascii="Kalinga" w:hAnsi="Kalinga"/>
+          <w:b w:val="0"/>
+          <w:bCs w:val="0"/>
+          <w:sz w:val="20"/>
+          <w:szCs w:val="20"/>
+        </w:rPr>
+      </w:pPr>
+      <w:r>
+        <w:rPr>
+          <w:rFonts w:hint="default" w:ascii="Kalinga" w:hAnsi="Kalinga"/>
+          <w:b w:val="0"/>
+          <w:bCs w:val="0"/>
+          <w:sz w:val="20"/>
+          <w:szCs w:val="20"/>
+        </w:rPr>
+        <w:t>{{text}}</w:t>
+      </w:r>
+    </w:p>
+    <w:p>
+      <w:pPr>
+        <w:spacing w:after="0" w:line="240" w:lineRule="auto"/>
+        <w:jc w:val="both"/>
+        <w:rPr>
+          <w:rFonts w:ascii="Kalinga" w:hAnsi="Kalinga" w:cs="Kalinga"/>
+          <w:b w:val="0"/>
+          <w:bCs w:val="0"/>
+          <w:sz w:val="20"/>
+          <w:szCs w:val="20"/>
+        </w:rPr>
+      </w:pPr>
+      <w:r>
+        <w:rPr>
+          <w:rFonts w:hint="default" w:ascii="Kalinga" w:hAnsi="Kalinga"/>
+          <w:b w:val="0"/>
+          <w:bCs w:val="0"/>
+          <w:sz w:val="20"/>
+          <w:szCs w:val="20"/>
+        </w:rPr>
+        <w:t>{{/list_verifikasi_rekan_kerja}}</w:t>
+      </w:r>
+    </w:p>
+    <w:p>
+      <w:pPr>
+        <w:spacing w:after="0" w:line="240" w:lineRule="auto"/>
+        <w:jc w:val="both"/>
+        <w:rPr>
+          <w:rFonts w:ascii="Kalinga" w:hAnsi="Kalinga" w:cs="Kalinga"/>
+          <w:b/>
+          <w:bCs/>
+          <w:sz w:val="20"/>
+          <w:szCs w:val="20"/>
+        </w:rPr>
+      </w:pPr>
+    </w:p>
+    <w:p>
+      <w:pPr>
+        <w:spacing w:after="0" w:line="240" w:lineRule="auto"/>
+        <w:jc w:val="both"/>
+        <w:rPr>
+          <w:rFonts w:hint="default" w:ascii="Kalinga" w:hAnsi="Kalinga"/>
+          <w:b/>
+          <w:bCs/>
+          <w:sz w:val="20"/>
+          <w:szCs w:val="20"/>
+          <w:lang w:val="en-US"/>
+        </w:rPr>
+      </w:pPr>
+      <w:bookmarkStart w:id="19" w:name="_GoBack"/>
+      <w:bookmarkEnd w:id="19"/>
+      <w:r>
+        <w:rPr>
+          <w:rFonts w:hint="default" w:ascii="Kalinga" w:hAnsi="Kalinga"/>
+          <w:b/>
+          <w:bCs/>
+          <w:sz w:val="20"/>
+          <w:szCs w:val="20"/>
+        </w:rPr>
+        <w:t xml:space="preserve">Tgl. Call Memo </w:t>
+      </w:r>
+      <w:r>
+        <w:rPr>
+          <w:rFonts w:hint="default" w:ascii="Kalinga" w:hAnsi="Kalinga"/>
+          <w:b/>
+          <w:bCs/>
+          <w:sz w:val="20"/>
+          <w:szCs w:val="20"/>
+        </w:rPr>
+        <w:tab/>
+      </w:r>
+      <w:r>
+        <w:rPr>
+          <w:rFonts w:hint="default" w:ascii="Kalinga" w:hAnsi="Kalinga"/>
+          <w:b/>
+          <w:bCs/>
+          <w:sz w:val="20"/>
+          <w:szCs w:val="20"/>
+        </w:rPr>
+        <w:tab/>
+      </w:r>
+      <w:r>
+        <w:rPr>
+          <w:rFonts w:hint="default" w:ascii="Kalinga" w:hAnsi="Kalinga"/>
+          <w:b/>
+          <w:bCs/>
+          <w:sz w:val="20"/>
+          <w:szCs w:val="20"/>
+        </w:rPr>
+        <w:t xml:space="preserve">: </w:t>
+      </w:r>
+      <w:r>
+        <w:rPr>
+          <w:rFonts w:hint="default" w:ascii="Kalinga" w:hAnsi="Kalinga"/>
+          <w:b/>
+          <w:bCs/>
+          <w:sz w:val="20"/>
+          <w:szCs w:val="20"/>
+          <w:lang w:val="en-US"/>
+        </w:rPr>
+        <w:t>{{</w:t>
+      </w:r>
+      <w:r>
+        <w:rPr>
+          <w:rFonts w:hint="default" w:ascii="Kalinga" w:hAnsi="Kalinga"/>
+          <w:b/>
+          <w:bCs/>
+          <w:sz w:val="20"/>
+          <w:szCs w:val="20"/>
+        </w:rPr>
+        <w:t>tgl_call_memo</w:t>
+      </w:r>
+      <w:r>
+        <w:rPr>
+          <w:rFonts w:hint="default" w:ascii="Kalinga" w:hAnsi="Kalinga"/>
+          <w:b/>
+          <w:bCs/>
+          <w:sz w:val="20"/>
+          <w:szCs w:val="20"/>
+          <w:lang w:val="en-US"/>
+        </w:rPr>
+        <w:t>}}</w:t>
+      </w:r>
+    </w:p>
+    <w:p>
+      <w:pPr>
+        <w:spacing w:after="0" w:line="240" w:lineRule="auto"/>
+        <w:jc w:val="both"/>
+        <w:rPr>
+          <w:rFonts w:hint="default" w:ascii="Kalinga" w:hAnsi="Kalinga"/>
+          <w:b/>
+          <w:bCs/>
+          <w:sz w:val="20"/>
+          <w:szCs w:val="20"/>
+        </w:rPr>
+      </w:pPr>
+      <w:r>
+        <w:rPr>
+          <w:rFonts w:hint="default" w:ascii="Kalinga" w:hAnsi="Kalinga"/>
+          <w:b/>
+          <w:bCs/>
+          <w:sz w:val="20"/>
+          <w:szCs w:val="20"/>
+        </w:rPr>
+        <w:t xml:space="preserve">Yang diverifikasi </w:t>
+      </w:r>
+      <w:r>
+        <w:rPr>
+          <w:rFonts w:hint="default" w:ascii="Kalinga" w:hAnsi="Kalinga"/>
+          <w:b/>
+          <w:bCs/>
+          <w:sz w:val="20"/>
+          <w:szCs w:val="20"/>
+        </w:rPr>
+        <w:tab/>
+      </w:r>
+      <w:r>
+        <w:rPr>
+          <w:rFonts w:hint="default" w:ascii="Kalinga" w:hAnsi="Kalinga"/>
+          <w:b/>
+          <w:bCs/>
+          <w:sz w:val="20"/>
+          <w:szCs w:val="20"/>
+        </w:rPr>
+        <w:t xml:space="preserve">: </w:t>
+      </w:r>
+      <w:r>
+        <w:rPr>
+          <w:rFonts w:hint="default" w:ascii="Kalinga" w:hAnsi="Kalinga"/>
+          <w:b/>
+          <w:bCs/>
+          <w:sz w:val="20"/>
+          <w:szCs w:val="20"/>
+          <w:lang w:val="en-US"/>
+        </w:rPr>
+        <w:t>{{</w:t>
+      </w:r>
+      <w:r>
+        <w:rPr>
+          <w:rFonts w:hint="default" w:ascii="Kalinga" w:hAnsi="Kalinga"/>
+          <w:b/>
+          <w:bCs/>
+          <w:sz w:val="20"/>
+          <w:szCs w:val="20"/>
+        </w:rPr>
+        <w:t>nama_kerabat</w:t>
+      </w:r>
+      <w:r>
+        <w:rPr>
+          <w:rFonts w:hint="default" w:ascii="Kalinga" w:hAnsi="Kalinga"/>
+          <w:b/>
+          <w:bCs/>
+          <w:sz w:val="20"/>
+          <w:szCs w:val="20"/>
+          <w:lang w:val="en-US"/>
+        </w:rPr>
+        <w:t>}}</w:t>
+      </w:r>
+      <w:r>
+        <w:rPr>
+          <w:rFonts w:hint="default" w:ascii="Kalinga" w:hAnsi="Kalinga"/>
+          <w:b/>
+          <w:bCs/>
+          <w:sz w:val="20"/>
+          <w:szCs w:val="20"/>
+        </w:rPr>
+        <w:t xml:space="preserve"> (</w:t>
+      </w:r>
+      <w:r>
+        <w:rPr>
+          <w:rFonts w:hint="default" w:ascii="Kalinga" w:hAnsi="Kalinga"/>
+          <w:b/>
+          <w:bCs/>
+          <w:sz w:val="20"/>
+          <w:szCs w:val="20"/>
+          <w:lang w:val="en-US"/>
+        </w:rPr>
+        <w:t>{{</w:t>
+      </w:r>
+      <w:r>
+        <w:rPr>
+          <w:rFonts w:hint="default" w:ascii="Kalinga" w:hAnsi="Kalinga"/>
+          <w:b/>
+          <w:bCs/>
+          <w:sz w:val="20"/>
+          <w:szCs w:val="20"/>
+        </w:rPr>
+        <w:t>hubungan_kerabat</w:t>
+      </w:r>
+      <w:r>
+        <w:rPr>
+          <w:rFonts w:hint="default" w:ascii="Kalinga" w:hAnsi="Kalinga"/>
+          <w:b/>
+          <w:bCs/>
+          <w:sz w:val="20"/>
+          <w:szCs w:val="20"/>
+          <w:lang w:val="en-US"/>
+        </w:rPr>
+        <w:t>}}</w:t>
+      </w:r>
+      <w:r>
+        <w:rPr>
+          <w:rFonts w:hint="default" w:ascii="Kalinga" w:hAnsi="Kalinga"/>
+          <w:b/>
+          <w:bCs/>
+          <w:sz w:val="20"/>
+          <w:szCs w:val="20"/>
+        </w:rPr>
+        <w:t>)</w:t>
+      </w:r>
+    </w:p>
+    <w:p>
+      <w:pPr>
+        <w:spacing w:after="0" w:line="240" w:lineRule="auto"/>
+        <w:jc w:val="both"/>
+        <w:rPr>
+          <w:rFonts w:hint="default" w:ascii="Kalinga" w:hAnsi="Kalinga"/>
+          <w:b/>
+          <w:bCs/>
+          <w:sz w:val="20"/>
+          <w:szCs w:val="20"/>
+        </w:rPr>
+      </w:pPr>
+      <w:r>
+        <w:rPr>
+          <w:rFonts w:hint="default" w:ascii="Kalinga" w:hAnsi="Kalinga"/>
+          <w:b/>
+          <w:bCs/>
+          <w:sz w:val="20"/>
+          <w:szCs w:val="20"/>
+        </w:rPr>
+        <w:t xml:space="preserve">Bentuk Call </w:t>
+      </w:r>
+      <w:r>
+        <w:rPr>
+          <w:rFonts w:hint="default" w:ascii="Kalinga" w:hAnsi="Kalinga"/>
+          <w:b/>
+          <w:bCs/>
+          <w:sz w:val="20"/>
+          <w:szCs w:val="20"/>
+        </w:rPr>
+        <w:tab/>
+      </w:r>
+      <w:r>
+        <w:rPr>
+          <w:rFonts w:hint="default" w:ascii="Kalinga" w:hAnsi="Kalinga"/>
+          <w:b/>
+          <w:bCs/>
+          <w:sz w:val="20"/>
+          <w:szCs w:val="20"/>
+        </w:rPr>
+        <w:tab/>
+      </w:r>
+      <w:r>
+        <w:rPr>
+          <w:rFonts w:hint="default" w:ascii="Kalinga" w:hAnsi="Kalinga"/>
+          <w:b/>
+          <w:bCs/>
+          <w:sz w:val="20"/>
+          <w:szCs w:val="20"/>
+        </w:rPr>
+        <w:t>: Wawancara via Telepon (</w:t>
+      </w:r>
+      <w:r>
+        <w:rPr>
+          <w:rFonts w:hint="default" w:ascii="Kalinga" w:hAnsi="Kalinga"/>
+          <w:b/>
+          <w:bCs/>
+          <w:sz w:val="20"/>
+          <w:szCs w:val="20"/>
+          <w:lang w:val="en-US"/>
+        </w:rPr>
+        <w:t>{{no_telepon_kerabat}}</w:t>
+      </w:r>
+      <w:r>
+        <w:rPr>
+          <w:rFonts w:hint="default" w:ascii="Kalinga" w:hAnsi="Kalinga"/>
+          <w:b/>
+          <w:bCs/>
+          <w:sz w:val="20"/>
+          <w:szCs w:val="20"/>
+        </w:rPr>
+        <w:t>)</w:t>
+      </w:r>
+    </w:p>
+    <w:p>
+      <w:pPr>
+        <w:spacing w:after="0" w:line="240" w:lineRule="auto"/>
+        <w:jc w:val="both"/>
+        <w:rPr>
+          <w:rFonts w:hint="default" w:ascii="Kalinga" w:hAnsi="Kalinga"/>
+          <w:b/>
+          <w:bCs/>
+          <w:sz w:val="20"/>
+          <w:szCs w:val="20"/>
+        </w:rPr>
+      </w:pPr>
+      <w:r>
+        <w:rPr>
+          <w:rFonts w:hint="default" w:ascii="Kalinga" w:hAnsi="Kalinga"/>
+          <w:b/>
+          <w:bCs/>
+          <w:sz w:val="20"/>
+          <w:szCs w:val="20"/>
+        </w:rPr>
+        <w:t xml:space="preserve">Tujuan Call </w:t>
+      </w:r>
+      <w:r>
+        <w:rPr>
+          <w:rFonts w:hint="default" w:ascii="Kalinga" w:hAnsi="Kalinga"/>
+          <w:b/>
+          <w:bCs/>
+          <w:sz w:val="20"/>
+          <w:szCs w:val="20"/>
+        </w:rPr>
+        <w:tab/>
+      </w:r>
+      <w:r>
+        <w:rPr>
+          <w:rFonts w:hint="default" w:ascii="Kalinga" w:hAnsi="Kalinga"/>
+          <w:b/>
+          <w:bCs/>
+          <w:sz w:val="20"/>
+          <w:szCs w:val="20"/>
+        </w:rPr>
+        <w:tab/>
+      </w:r>
+      <w:r>
+        <w:rPr>
+          <w:rFonts w:hint="default" w:ascii="Kalinga" w:hAnsi="Kalinga"/>
+          <w:b/>
+          <w:bCs/>
+          <w:sz w:val="20"/>
+          <w:szCs w:val="20"/>
+        </w:rPr>
+        <w:t>: Konfirmasi Kerabat</w:t>
+      </w:r>
+    </w:p>
+    <w:p>
+      <w:pPr>
+        <w:spacing w:after="0" w:line="240" w:lineRule="auto"/>
+        <w:jc w:val="both"/>
+        <w:rPr>
+          <w:rFonts w:hint="default" w:ascii="Kalinga" w:hAnsi="Kalinga" w:cs="Kalinga"/>
+          <w:color w:val="auto"/>
+          <w:sz w:val="20"/>
+          <w:szCs w:val="20"/>
+          <w:lang w:val="en-US"/>
+        </w:rPr>
+      </w:pPr>
+      <w:r>
+        <w:rPr>
+          <w:rFonts w:hint="default" w:ascii="Kalinga" w:hAnsi="Kalinga"/>
+          <w:b/>
+          <w:bCs/>
+          <w:sz w:val="20"/>
+          <w:szCs w:val="20"/>
+        </w:rPr>
+        <w:t>Informasi yang diberikan</w:t>
+      </w:r>
+      <w:r>
+        <w:rPr>
+          <w:rFonts w:hint="default" w:ascii="Kalinga" w:hAnsi="Kalinga"/>
+          <w:b/>
+          <w:bCs/>
+          <w:sz w:val="20"/>
+          <w:szCs w:val="20"/>
+        </w:rPr>
+        <w:tab/>
+      </w:r>
+      <w:r>
+        <w:rPr>
+          <w:rFonts w:hint="default" w:ascii="Kalinga" w:hAnsi="Kalinga"/>
+          <w:b/>
+          <w:bCs/>
+          <w:sz w:val="20"/>
+          <w:szCs w:val="20"/>
+        </w:rPr>
+        <w:t>:</w:t>
+      </w:r>
     </w:p>
     <w:p>
       <w:pPr>
@@ -1512,32 +2670,41 @@
         <w:jc w:val="both"/>
         <w:rPr>
           <w:rFonts w:hint="default" w:ascii="Kalinga" w:hAnsi="Kalinga"/>
-          <w:color w:val="auto"/>
-          <w:sz w:val="20"/>
-          <w:szCs w:val="20"/>
-        </w:rPr>
-      </w:pPr>
-      <w:r>
-        <w:rPr>
-          <w:rFonts w:hint="default" w:ascii="Kalinga" w:hAnsi="Kalinga"/>
-          <w:b/>
-          <w:bCs/>
-          <w:color w:val="auto"/>
-          <w:sz w:val="20"/>
-          <w:szCs w:val="20"/>
-          <w:u w:val="single"/>
-          <w:lang w:val="en-US"/>
-        </w:rPr>
-        <w:t>PERHITUNGAN REPAYMENT CAPACITY</w:t>
-      </w:r>
-      <w:r>
-        <w:rPr>
-          <w:rFonts w:hint="default" w:ascii="Kalinga" w:hAnsi="Kalinga"/>
-          <w:color w:val="auto"/>
-          <w:sz w:val="20"/>
-          <w:szCs w:val="20"/>
-        </w:rPr>
-        <w:t xml:space="preserve"> :</w:t>
+          <w:sz w:val="20"/>
+          <w:szCs w:val="20"/>
+        </w:rPr>
+      </w:pPr>
+      <w:r>
+        <w:rPr>
+          <w:rFonts w:hint="default" w:ascii="Kalinga" w:hAnsi="Kalinga"/>
+          <w:sz w:val="20"/>
+          <w:szCs w:val="20"/>
+        </w:rPr>
+        <w:t>{{#list_verifikasi_kerabat}}</w:t>
+      </w:r>
+    </w:p>
+    <w:p>
+      <w:pPr>
+        <w:numPr>
+          <w:ilvl w:val="0"/>
+          <w:numId w:val="1"/>
+        </w:numPr>
+        <w:spacing w:after="0" w:line="240" w:lineRule="auto"/>
+        <w:ind w:left="440" w:leftChars="0" w:hanging="360" w:firstLineChars="0"/>
+        <w:jc w:val="both"/>
+        <w:rPr>
+          <w:rFonts w:hint="default" w:ascii="Kalinga" w:hAnsi="Kalinga"/>
+          <w:sz w:val="20"/>
+          <w:szCs w:val="20"/>
+        </w:rPr>
+      </w:pPr>
+      <w:r>
+        <w:rPr>
+          <w:rFonts w:hint="default" w:ascii="Kalinga" w:hAnsi="Kalinga"/>
+          <w:sz w:val="20"/>
+          <w:szCs w:val="20"/>
+        </w:rPr>
+        <w:t>{{text}}</w:t>
       </w:r>
     </w:p>
     <w:p>
@@ -1549,58 +2716,18 @@
         <w:spacing w:after="0" w:line="240" w:lineRule="auto"/>
         <w:jc w:val="both"/>
         <w:rPr>
-          <w:rFonts w:hint="default" w:ascii="Kalinga" w:hAnsi="Kalinga"/>
-          <w:color w:val="auto"/>
-          <w:sz w:val="20"/>
-          <w:szCs w:val="20"/>
-        </w:rPr>
-      </w:pPr>
-      <w:r>
-        <w:rPr>
-          <w:rFonts w:hint="default" w:ascii="Kalinga" w:hAnsi="Kalinga"/>
-          <w:color w:val="auto"/>
-          <w:sz w:val="20"/>
-          <w:szCs w:val="20"/>
-        </w:rPr>
-        <w:t xml:space="preserve">Penghasilan Pemohon Cfm. </w:t>
-      </w:r>
-      <w:r>
-        <w:rPr>
-          <w:rFonts w:hint="default" w:ascii="Kalinga" w:hAnsi="Kalinga"/>
-          <w:color w:val="auto"/>
-          <w:sz w:val="20"/>
-          <w:szCs w:val="20"/>
-          <w:lang w:val="en-US"/>
-        </w:rPr>
-        <w:t>Rekening Koran Gaji di</w:t>
-      </w:r>
-      <w:r>
-        <w:rPr>
-          <w:rFonts w:hint="default" w:ascii="Kalinga" w:hAnsi="Kalinga"/>
-          <w:color w:val="auto"/>
-          <w:sz w:val="20"/>
-          <w:szCs w:val="20"/>
-        </w:rPr>
-        <w:t xml:space="preserve"> {{payroll_bank}} nomor {{payroll_no_rek}} atas nama </w:t>
-      </w:r>
-      <w:r>
-        <w:rPr>
-          <w:rFonts w:hint="default" w:ascii="Kalinga" w:hAnsi="Kalinga"/>
-          <w:color w:val="auto"/>
-          <w:sz w:val="20"/>
-          <w:szCs w:val="20"/>
-          <w:lang w:val="en-US"/>
-        </w:rPr>
-        <w:t>{{nama_pemohon}}</w:t>
-      </w:r>
-      <w:r>
-        <w:rPr>
-          <w:rFonts w:hint="default" w:ascii="Kalinga" w:hAnsi="Kalinga"/>
-          <w:color w:val="auto"/>
-          <w:sz w:val="20"/>
-          <w:szCs w:val="20"/>
-        </w:rPr>
-        <w:t xml:space="preserve"> dengan data sebagai berikut :</w:t>
+          <w:rFonts w:ascii="Kalinga" w:hAnsi="Kalinga" w:cs="Kalinga"/>
+          <w:sz w:val="20"/>
+          <w:szCs w:val="20"/>
+        </w:rPr>
+      </w:pPr>
+      <w:r>
+        <w:rPr>
+          <w:rFonts w:hint="default" w:ascii="Kalinga" w:hAnsi="Kalinga"/>
+          <w:sz w:val="20"/>
+          <w:szCs w:val="20"/>
+        </w:rPr>
+        <w:t>{{/list_verifikasi_kerabat}}</w:t>
       </w:r>
     </w:p>
     <w:p>
@@ -1613,101 +2740,30 @@
         <w:jc w:val="both"/>
         <w:rPr>
           <w:rFonts w:hint="default" w:ascii="Kalinga" w:hAnsi="Kalinga"/>
-          <w:color w:val="auto"/>
-          <w:sz w:val="20"/>
-          <w:szCs w:val="20"/>
-        </w:rPr>
-      </w:pPr>
-    </w:p>
-    <w:p>
-      <w:pPr>
-        <w:numPr>
-          <w:ilvl w:val="0"/>
-          <w:numId w:val="0"/>
-        </w:numPr>
-        <w:spacing w:after="0" w:line="240" w:lineRule="auto"/>
-        <w:jc w:val="both"/>
-        <w:rPr>
-          <w:rFonts w:hint="default" w:ascii="Kalinga" w:hAnsi="Kalinga"/>
-          <w:b/>
-          <w:bCs/>
-          <w:color w:val="auto"/>
-          <w:sz w:val="20"/>
-          <w:szCs w:val="20"/>
-          <w:lang w:val="en-US"/>
-        </w:rPr>
-      </w:pPr>
-      <w:r>
-        <w:rPr>
-          <w:rFonts w:hint="default" w:ascii="Kalinga" w:hAnsi="Kalinga"/>
-          <w:b/>
-          <w:bCs/>
-          <w:color w:val="auto"/>
-          <w:sz w:val="20"/>
-          <w:szCs w:val="20"/>
-          <w:lang w:val="en-US"/>
-        </w:rPr>
-        <w:t>Gaji Pensiun {{pensiun_bulan_3_nama}}</w:t>
-      </w:r>
-      <w:r>
-        <w:rPr>
-          <w:rFonts w:hint="default" w:ascii="Kalinga" w:hAnsi="Kalinga"/>
-          <w:b/>
-          <w:bCs/>
-          <w:color w:val="auto"/>
-          <w:sz w:val="20"/>
-          <w:szCs w:val="20"/>
-          <w:lang w:val="en-US"/>
-        </w:rPr>
-        <w:tab/>
-      </w:r>
-      <w:r>
-        <w:rPr>
-          <w:rFonts w:hint="default" w:ascii="Kalinga" w:hAnsi="Kalinga"/>
-          <w:b/>
-          <w:bCs/>
-          <w:color w:val="auto"/>
-          <w:sz w:val="20"/>
-          <w:szCs w:val="20"/>
-          <w:lang w:val="en-US"/>
-        </w:rPr>
-        <w:tab/>
-      </w:r>
-      <w:r>
-        <w:rPr>
-          <w:rFonts w:hint="default" w:ascii="Kalinga" w:hAnsi="Kalinga"/>
-          <w:b/>
-          <w:bCs/>
-          <w:color w:val="auto"/>
-          <w:sz w:val="20"/>
-          <w:szCs w:val="20"/>
-          <w:lang w:val="en-US"/>
-        </w:rPr>
-        <w:tab/>
-      </w:r>
-      <w:r>
-        <w:rPr>
-          <w:rFonts w:hint="default" w:ascii="Kalinga" w:hAnsi="Kalinga"/>
-          <w:b/>
-          <w:bCs/>
-          <w:color w:val="auto"/>
-          <w:sz w:val="20"/>
-          <w:szCs w:val="20"/>
-        </w:rPr>
-        <w:t xml:space="preserve">:  </w:t>
-      </w:r>
-      <w:r>
-        <w:rPr>
-          <w:rFonts w:hint="default" w:ascii="Kalinga" w:hAnsi="Kalinga"/>
           <w:b/>
           <w:bCs/>
           <w:color w:val="auto"/>
           <w:sz w:val="20"/>
           <w:szCs w:val="20"/>
           <w:u w:val="single"/>
-        </w:rPr>
-        <w:t>Rp. {{pensiun_bulan_3}},-</w:t>
-      </w:r>
+          <w:lang w:val="en-US"/>
+        </w:rPr>
+      </w:pPr>
+    </w:p>
+    <w:p>
+      <w:pPr>
+        <w:spacing w:after="0" w:line="240" w:lineRule="auto"/>
+        <w:rPr>
+          <w:rFonts w:hint="default" w:ascii="Kalinga" w:hAnsi="Kalinga"/>
+          <w:b w:val="0"/>
+          <w:bCs w:val="0"/>
+          <w:color w:val="auto"/>
+          <w:sz w:val="20"/>
+          <w:szCs w:val="20"/>
+          <w:u w:val="none"/>
+          <w:lang w:val="en-US"/>
+        </w:rPr>
+      </w:pPr>
       <w:r>
         <w:rPr>
           <w:rFonts w:hint="default" w:ascii="Kalinga" w:hAnsi="Kalinga"/>
@@ -1719,84 +2775,7 @@
           <w:u w:val="single"/>
           <w:lang w:val="en-US"/>
         </w:rPr>
-        <w:t>.</w:t>
-      </w:r>
-    </w:p>
-    <w:p>
-      <w:pPr>
-        <w:numPr>
-          <w:ilvl w:val="0"/>
-          <w:numId w:val="0"/>
-        </w:numPr>
-        <w:spacing w:after="0" w:line="240" w:lineRule="auto"/>
-        <w:jc w:val="both"/>
-        <w:rPr>
-          <w:rFonts w:hint="default" w:ascii="Kalinga" w:hAnsi="Kalinga"/>
-          <w:b/>
-          <w:bCs/>
-          <w:color w:val="auto"/>
-          <w:sz w:val="20"/>
-          <w:szCs w:val="20"/>
-          <w:lang w:val="en-US"/>
-        </w:rPr>
-      </w:pPr>
-      <w:r>
-        <w:rPr>
-          <w:rFonts w:hint="default" w:ascii="Kalinga" w:hAnsi="Kalinga"/>
-          <w:b/>
-          <w:bCs/>
-          <w:color w:val="auto"/>
-          <w:sz w:val="20"/>
-          <w:szCs w:val="20"/>
-        </w:rPr>
-        <w:t>Penghasilan Pemohon</w:t>
-      </w:r>
-      <w:r>
-        <w:rPr>
-          <w:rFonts w:hint="default" w:ascii="Kalinga" w:hAnsi="Kalinga"/>
-          <w:b/>
-          <w:bCs/>
-          <w:color w:val="auto"/>
-          <w:sz w:val="20"/>
-          <w:szCs w:val="20"/>
-          <w:lang w:val="en-US"/>
-        </w:rPr>
-        <w:tab/>
-      </w:r>
-      <w:r>
-        <w:rPr>
-          <w:rFonts w:hint="default" w:ascii="Kalinga" w:hAnsi="Kalinga"/>
-          <w:b/>
-          <w:bCs/>
-          <w:color w:val="auto"/>
-          <w:sz w:val="20"/>
-          <w:szCs w:val="20"/>
-          <w:lang w:val="en-US"/>
-        </w:rPr>
-        <w:tab/>
-      </w:r>
-      <w:r>
-        <w:rPr>
-          <w:rFonts w:hint="default" w:ascii="Kalinga" w:hAnsi="Kalinga"/>
-          <w:b/>
-          <w:bCs/>
-          <w:color w:val="auto"/>
-          <w:sz w:val="20"/>
-          <w:szCs w:val="20"/>
-          <w:lang w:val="en-US"/>
-        </w:rPr>
-        <w:tab/>
-      </w:r>
-      <w:r>
-        <w:rPr>
-          <w:rFonts w:hint="default" w:ascii="Kalinga" w:hAnsi="Kalinga"/>
-          <w:b/>
-          <w:bCs/>
-          <w:color w:val="auto"/>
-          <w:sz w:val="20"/>
-          <w:szCs w:val="20"/>
-        </w:rPr>
-        <w:t xml:space="preserve">:  </w:t>
+        <w:t>PERHITUNGAN REPAYMENT CAPACITY :</w:t>
       </w:r>
       <w:r>
         <w:rPr>
@@ -1807,178 +2786,243 @@
           <w:sz w:val="20"/>
           <w:szCs w:val="20"/>
           <w:u w:val="single"/>
-        </w:rPr>
-        <w:t>Rp. {{rpc_penghasilan}},-</w:t>
-      </w:r>
-      <w:r>
-        <w:rPr>
-          <w:rFonts w:hint="default" w:ascii="Kalinga" w:hAnsi="Kalinga"/>
-          <w:b/>
-          <w:bCs/>
-          <w:color w:val="auto"/>
-          <w:sz w:val="20"/>
-          <w:szCs w:val="20"/>
-          <w:u w:val="single"/>
-          <w:lang w:val="en-US"/>
-        </w:rPr>
-        <w:t>.</w:t>
-      </w:r>
-    </w:p>
-    <w:p>
-      <w:pPr>
-        <w:numPr>
-          <w:ilvl w:val="0"/>
-          <w:numId w:val="0"/>
-        </w:numPr>
-        <w:spacing w:after="0" w:line="240" w:lineRule="auto"/>
-        <w:jc w:val="both"/>
-        <w:rPr>
-          <w:rFonts w:hint="default" w:ascii="Kalinga" w:hAnsi="Kalinga"/>
-          <w:b/>
-          <w:bCs/>
-          <w:color w:val="auto"/>
-          <w:sz w:val="20"/>
-          <w:szCs w:val="20"/>
-          <w:lang w:val="en-US"/>
-        </w:rPr>
-      </w:pPr>
-      <w:r>
-        <w:rPr>
-          <w:rFonts w:hint="default" w:ascii="Kalinga" w:hAnsi="Kalinga"/>
-          <w:b/>
-          <w:bCs/>
-          <w:color w:val="auto"/>
-          <w:sz w:val="20"/>
-          <w:szCs w:val="20"/>
-        </w:rPr>
-        <w:t>DSC 90 %</w:t>
-      </w:r>
-      <w:r>
-        <w:rPr>
-          <w:rFonts w:hint="default" w:ascii="Kalinga" w:hAnsi="Kalinga"/>
-          <w:b/>
-          <w:bCs/>
-          <w:color w:val="auto"/>
-          <w:sz w:val="20"/>
-          <w:szCs w:val="20"/>
-          <w:lang w:val="en-US"/>
-        </w:rPr>
-        <w:tab/>
-      </w:r>
-      <w:r>
-        <w:rPr>
-          <w:rFonts w:hint="default" w:ascii="Kalinga" w:hAnsi="Kalinga"/>
-          <w:b/>
-          <w:bCs/>
-          <w:color w:val="auto"/>
-          <w:sz w:val="20"/>
-          <w:szCs w:val="20"/>
-          <w:lang w:val="en-US"/>
-        </w:rPr>
-        <w:tab/>
-      </w:r>
-      <w:r>
-        <w:rPr>
-          <w:rFonts w:hint="default" w:ascii="Kalinga" w:hAnsi="Kalinga"/>
-          <w:b/>
-          <w:bCs/>
-          <w:color w:val="auto"/>
-          <w:sz w:val="20"/>
-          <w:szCs w:val="20"/>
-          <w:lang w:val="en-US"/>
-        </w:rPr>
-        <w:tab/>
-      </w:r>
-      <w:r>
-        <w:rPr>
-          <w:rFonts w:hint="default" w:ascii="Kalinga" w:hAnsi="Kalinga"/>
-          <w:b/>
-          <w:bCs/>
-          <w:color w:val="auto"/>
-          <w:sz w:val="20"/>
-          <w:szCs w:val="20"/>
-          <w:lang w:val="en-US"/>
-        </w:rPr>
-        <w:tab/>
-      </w:r>
-      <w:r>
-        <w:rPr>
-          <w:rFonts w:hint="default" w:ascii="Kalinga" w:hAnsi="Kalinga"/>
-          <w:b/>
-          <w:bCs/>
-          <w:color w:val="auto"/>
-          <w:sz w:val="20"/>
-          <w:szCs w:val="20"/>
-        </w:rPr>
-        <w:t>:  Rp. {{rpc_dsc_90}},-</w:t>
-      </w:r>
-      <w:r>
-        <w:rPr>
-          <w:rFonts w:hint="default" w:ascii="Kalinga" w:hAnsi="Kalinga"/>
-          <w:b/>
-          <w:bCs/>
-          <w:color w:val="auto"/>
-          <w:sz w:val="20"/>
-          <w:szCs w:val="20"/>
-          <w:lang w:val="en-US"/>
-        </w:rPr>
-        <w:t>.</w:t>
-      </w:r>
-    </w:p>
-    <w:p>
-      <w:pPr>
-        <w:numPr>
-          <w:ilvl w:val="0"/>
-          <w:numId w:val="0"/>
-        </w:numPr>
-        <w:spacing w:after="0" w:line="240" w:lineRule="auto"/>
-        <w:jc w:val="both"/>
-        <w:rPr>
-          <w:rFonts w:hint="default" w:ascii="Kalinga" w:hAnsi="Kalinga"/>
-          <w:color w:val="auto"/>
-          <w:sz w:val="20"/>
-          <w:szCs w:val="20"/>
-        </w:rPr>
-      </w:pPr>
-    </w:p>
-    <w:p>
-      <w:pPr>
-        <w:numPr>
-          <w:ilvl w:val="0"/>
-          <w:numId w:val="0"/>
-        </w:numPr>
-        <w:spacing w:after="0" w:line="240" w:lineRule="auto"/>
-        <w:jc w:val="both"/>
-        <w:rPr>
-          <w:rFonts w:hint="default" w:ascii="Kalinga" w:hAnsi="Kalinga"/>
-          <w:color w:val="auto"/>
-          <w:sz w:val="20"/>
-          <w:szCs w:val="20"/>
-        </w:rPr>
-      </w:pPr>
-      <w:r>
-        <w:rPr>
-          <w:rFonts w:hint="default" w:ascii="Kalinga" w:hAnsi="Kalinga"/>
-          <w:color w:val="auto"/>
-          <w:sz w:val="20"/>
-          <w:szCs w:val="20"/>
-        </w:rPr>
-        <w:t>Cfm. E-PP Kredit CR, Buku IV, Nama Bab BNI Fleksi, Nama Sub Bab Ketentuan Umum, Bab I Sub Sub 01, Halaman 18, Tanggal 18-05-2018 pada poin 3. Untuk Pensiunan dan Calon Pensiunan Maksimal DSR = 90% dari total Pendapatan Tetap (yang akan diterima) per bulan Tanpa Memperhitungkan Kewajiban Ybs. di Bank/Lembaga Keuangan Non Bank Lainnya.</w:t>
-      </w:r>
-    </w:p>
-    <w:p>
-      <w:pPr>
-        <w:numPr>
-          <w:ilvl w:val="0"/>
-          <w:numId w:val="0"/>
-        </w:numPr>
-        <w:spacing w:after="0" w:line="240" w:lineRule="auto"/>
-        <w:jc w:val="both"/>
-        <w:rPr>
-          <w:rFonts w:hint="default" w:ascii="Kalinga" w:hAnsi="Kalinga"/>
-          <w:color w:val="auto"/>
-          <w:sz w:val="20"/>
-          <w:szCs w:val="20"/>
+          <w:lang w:val="en-US"/>
+        </w:rPr>
+        <w:tab/>
+      </w:r>
+      <w:r>
+        <w:rPr>
+          <w:rFonts w:hint="default" w:ascii="Kalinga" w:hAnsi="Kalinga"/>
+          <w:b w:val="0"/>
+          <w:bCs w:val="0"/>
+          <w:color w:val="auto"/>
+          <w:sz w:val="20"/>
+          <w:szCs w:val="20"/>
+          <w:u w:val="none"/>
+          <w:lang w:val="en-US"/>
+        </w:rPr>
+        <w:tab/>
+      </w:r>
+    </w:p>
+    <w:p>
+      <w:pPr>
+        <w:spacing w:after="0" w:line="240" w:lineRule="auto"/>
+        <w:rPr>
+          <w:rFonts w:hint="default" w:ascii="Kalinga" w:hAnsi="Kalinga"/>
+          <w:b w:val="0"/>
+          <w:bCs w:val="0"/>
+          <w:color w:val="auto"/>
+          <w:sz w:val="20"/>
+          <w:szCs w:val="20"/>
+          <w:u w:val="none"/>
+          <w:lang w:val="en-US"/>
+        </w:rPr>
+      </w:pPr>
+      <w:r>
+        <w:rPr>
+          <w:rFonts w:hint="default" w:ascii="Kalinga" w:hAnsi="Kalinga"/>
+          <w:b w:val="0"/>
+          <w:bCs w:val="0"/>
+          <w:color w:val="auto"/>
+          <w:sz w:val="20"/>
+          <w:szCs w:val="20"/>
+          <w:u w:val="none"/>
+          <w:lang w:val="en-US"/>
+        </w:rPr>
+        <w:t>Penghasilan Pemohon Cfm. Slip Gaji dan Rekening Koran Gaji Pemohon di BNI Nomor Rekening {{aktif_nomor_rekening_gaji}} atas nama {{nama_pemohon}} dengan data sebagai berikut :</w:t>
+      </w:r>
+      <w:r>
+        <w:rPr>
+          <w:rFonts w:hint="default" w:ascii="Kalinga" w:hAnsi="Kalinga"/>
+          <w:b w:val="0"/>
+          <w:bCs w:val="0"/>
+          <w:color w:val="auto"/>
+          <w:sz w:val="20"/>
+          <w:szCs w:val="20"/>
+          <w:u w:val="none"/>
+          <w:lang w:val="en-US"/>
+        </w:rPr>
+        <w:tab/>
+      </w:r>
+      <w:r>
+        <w:rPr>
+          <w:rFonts w:hint="default" w:ascii="Kalinga" w:hAnsi="Kalinga"/>
+          <w:b w:val="0"/>
+          <w:bCs w:val="0"/>
+          <w:color w:val="auto"/>
+          <w:sz w:val="20"/>
+          <w:szCs w:val="20"/>
+          <w:u w:val="none"/>
+          <w:lang w:val="en-US"/>
+        </w:rPr>
+        <w:tab/>
+      </w:r>
+    </w:p>
+    <w:p>
+      <w:pPr>
+        <w:spacing w:after="0" w:line="240" w:lineRule="auto"/>
+        <w:rPr>
+          <w:rFonts w:hint="default" w:ascii="Kalinga" w:hAnsi="Kalinga"/>
+          <w:b w:val="0"/>
+          <w:bCs w:val="0"/>
+          <w:color w:val="auto"/>
+          <w:sz w:val="20"/>
+          <w:szCs w:val="20"/>
+          <w:u w:val="none"/>
+          <w:lang w:val="en-US"/>
+        </w:rPr>
+      </w:pPr>
+    </w:p>
+    <w:p>
+      <w:pPr>
+        <w:spacing w:after="0" w:line="240" w:lineRule="auto"/>
+        <w:rPr>
+          <w:rFonts w:hint="default" w:ascii="Kalinga" w:hAnsi="Kalinga"/>
+          <w:b w:val="0"/>
+          <w:bCs w:val="0"/>
+          <w:color w:val="auto"/>
+          <w:sz w:val="20"/>
+          <w:szCs w:val="20"/>
+          <w:u w:val="none"/>
+          <w:lang w:val="en-US"/>
+        </w:rPr>
+      </w:pPr>
+      <w:r>
+        <w:rPr>
+          <w:rFonts w:hint="default" w:ascii="Kalinga" w:hAnsi="Kalinga"/>
+          <w:b w:val="0"/>
+          <w:bCs w:val="0"/>
+          <w:color w:val="auto"/>
+          <w:sz w:val="20"/>
+          <w:szCs w:val="20"/>
+          <w:u w:val="none"/>
+          <w:lang w:val="en-US"/>
+        </w:rPr>
+        <w:t xml:space="preserve">Gaji Bulan {{aktif_bulan_gaji}} </w:t>
+      </w:r>
+      <w:r>
+        <w:rPr>
+          <w:rFonts w:hint="default" w:ascii="Kalinga" w:hAnsi="Kalinga"/>
+          <w:b w:val="0"/>
+          <w:bCs w:val="0"/>
+          <w:color w:val="auto"/>
+          <w:sz w:val="20"/>
+          <w:szCs w:val="20"/>
+          <w:u w:val="none"/>
+          <w:lang w:val="en-US"/>
+        </w:rPr>
+        <w:tab/>
+        <w:t>: {{aktif_jumlah_gaji_bulan}}</w:t>
+      </w:r>
+    </w:p>
+    <w:p>
+      <w:pPr>
+        <w:spacing w:after="0" w:line="240" w:lineRule="auto"/>
+        <w:rPr>
+          <w:rFonts w:hint="default" w:ascii="Kalinga" w:hAnsi="Kalinga"/>
+          <w:b w:val="0"/>
+          <w:bCs w:val="0"/>
+          <w:color w:val="auto"/>
+          <w:sz w:val="20"/>
+          <w:szCs w:val="20"/>
+          <w:u w:val="none"/>
+          <w:lang w:val="en-US"/>
+        </w:rPr>
+      </w:pPr>
+      <w:r>
+        <w:rPr>
+          <w:rFonts w:hint="default" w:ascii="Kalinga" w:hAnsi="Kalinga"/>
+          <w:b w:val="0"/>
+          <w:bCs w:val="0"/>
+          <w:color w:val="auto"/>
+          <w:sz w:val="20"/>
+          <w:szCs w:val="20"/>
+          <w:u w:val="none"/>
+          <w:lang w:val="en-US"/>
+        </w:rPr>
+        <w:t xml:space="preserve">Penghasilan Calon Debitur </w:t>
+      </w:r>
+      <w:r>
+        <w:rPr>
+          <w:rFonts w:hint="default" w:ascii="Kalinga" w:hAnsi="Kalinga"/>
+          <w:b w:val="0"/>
+          <w:bCs w:val="0"/>
+          <w:color w:val="auto"/>
+          <w:sz w:val="20"/>
+          <w:szCs w:val="20"/>
+          <w:u w:val="none"/>
+          <w:lang w:val="en-US"/>
+        </w:rPr>
+        <w:tab/>
+        <w:t>: {{aktif_penghasilan_calon_debitur}}</w:t>
+      </w:r>
+    </w:p>
+    <w:p>
+      <w:pPr>
+        <w:spacing w:after="0" w:line="240" w:lineRule="auto"/>
+        <w:rPr>
+          <w:rFonts w:hint="default" w:ascii="Kalinga" w:hAnsi="Kalinga"/>
+          <w:b w:val="0"/>
+          <w:bCs w:val="0"/>
+          <w:color w:val="auto"/>
+          <w:sz w:val="20"/>
+          <w:szCs w:val="20"/>
+          <w:u w:val="none"/>
+          <w:lang w:val="en-US"/>
+        </w:rPr>
+      </w:pPr>
+      <w:r>
+        <w:rPr>
+          <w:rFonts w:hint="default" w:ascii="Kalinga" w:hAnsi="Kalinga"/>
+          <w:b w:val="0"/>
+          <w:bCs w:val="0"/>
+          <w:color w:val="auto"/>
+          <w:sz w:val="20"/>
+          <w:szCs w:val="20"/>
+          <w:u w:val="none"/>
+          <w:lang w:val="en-US"/>
+        </w:rPr>
+        <w:t>DSC 60%                                       : {{aktif_dsc_60}}</w:t>
+      </w:r>
+      <w:r>
+        <w:rPr>
+          <w:rFonts w:hint="default" w:ascii="Kalinga" w:hAnsi="Kalinga"/>
+          <w:b w:val="0"/>
+          <w:bCs w:val="0"/>
+          <w:color w:val="auto"/>
+          <w:sz w:val="20"/>
+          <w:szCs w:val="20"/>
+          <w:u w:val="none"/>
+          <w:lang w:val="en-US"/>
+        </w:rPr>
+        <w:tab/>
+      </w:r>
+      <w:r>
+        <w:rPr>
+          <w:rFonts w:hint="default" w:ascii="Kalinga" w:hAnsi="Kalinga"/>
+          <w:b w:val="0"/>
+          <w:bCs w:val="0"/>
+          <w:color w:val="auto"/>
+          <w:sz w:val="20"/>
+          <w:szCs w:val="20"/>
+          <w:u w:val="none"/>
+          <w:lang w:val="en-US"/>
+        </w:rPr>
+        <w:tab/>
+      </w:r>
+    </w:p>
+    <w:p>
+      <w:pPr>
+        <w:spacing w:after="0" w:line="240" w:lineRule="auto"/>
+        <w:rPr>
+          <w:rFonts w:hint="default" w:ascii="Kalinga" w:hAnsi="Kalinga"/>
+          <w:b w:val="0"/>
+          <w:bCs w:val="0"/>
+          <w:color w:val="auto"/>
+          <w:sz w:val="20"/>
+          <w:szCs w:val="20"/>
+          <w:u w:val="none"/>
+          <w:lang w:val="en-US"/>
         </w:rPr>
       </w:pPr>
     </w:p>
@@ -2007,17 +3051,21 @@
         </w:rPr>
         <w:t>Cfm. Info SLIK Ideb posisi terakhir Tanggal {{tgl_slik}} Pemohon memiliki Fasilitas Kredit sebagai berikut :</w:t>
       </w:r>
-      <w:r>
-        <w:rPr>
-          <w:rFonts w:hint="default" w:ascii="Kalinga" w:hAnsi="Kalinga"/>
-          <w:b/>
-          <w:bCs/>
-          <w:color w:val="auto"/>
-          <w:sz w:val="20"/>
-          <w:szCs w:val="20"/>
-        </w:rPr>
-        <w:br w:type="textWrapping"/>
-      </w:r>
+    </w:p>
+    <w:p>
+      <w:pPr>
+        <w:spacing w:after="0" w:line="240" w:lineRule="auto"/>
+        <w:ind w:left="0" w:leftChars="0" w:firstLine="0" w:firstLineChars="0"/>
+        <w:jc w:val="both"/>
+        <w:rPr>
+          <w:rFonts w:hint="default" w:ascii="Kalinga" w:hAnsi="Kalinga"/>
+          <w:b w:val="0"/>
+          <w:bCs w:val="0"/>
+          <w:color w:val="auto"/>
+          <w:sz w:val="20"/>
+          <w:szCs w:val="20"/>
+        </w:rPr>
+      </w:pPr>
       <w:r>
         <w:rPr>
           <w:rFonts w:hint="default" w:ascii="Kalinga" w:hAnsi="Kalinga"/>
@@ -2051,13 +3099,22 @@
       <w:r>
         <w:rPr>
           <w:rFonts w:hint="default" w:ascii="Kalinga" w:hAnsi="Kalinga"/>
-          <w:b w:val="0"/>
-          <w:bCs w:val="0"/>
-          <w:color w:val="auto"/>
-          <w:sz w:val="20"/>
-          <w:szCs w:val="20"/>
-        </w:rPr>
-        <w:t>Fasilitas Kredit {{jenis_kredit}} di {{nama_bank}} maks Rp. {{plafon_maks}} outs Rp. {{outstanding}} angsuran Rp. {{angsuran}} Coll {{kolektibilitas}}. {{alasan}}</w:t>
+          <w:color w:val="auto"/>
+          <w:sz w:val="20"/>
+          <w:szCs w:val="20"/>
+        </w:rPr>
+        <w:t xml:space="preserve">Fasilitas </w:t>
+      </w:r>
+      <w:r>
+        <w:rPr>
+          <w:rFonts w:hint="default" w:ascii="Kalinga" w:hAnsi="Kalinga"/>
+          <w:b w:val="0"/>
+          <w:bCs w:val="0"/>
+          <w:color w:val="auto"/>
+          <w:sz w:val="20"/>
+          <w:szCs w:val="20"/>
+        </w:rPr>
+        <w:t>Kredit {{jenis_kredit}} di {{nama_bank}} maks Rp. {{plafon_maks}} outs Rp. {{outstanding}} angsuran Rp. {{angsuran}} Coll {{kolektibilitas}}. {{alasan}}</w:t>
       </w:r>
     </w:p>
     <w:p>
@@ -2203,519 +3260,313 @@
     <w:p>
       <w:pPr>
         <w:spacing w:after="0" w:line="240" w:lineRule="auto"/>
+        <w:rPr>
+          <w:rFonts w:hint="default" w:ascii="Kalinga" w:hAnsi="Kalinga"/>
+          <w:b w:val="0"/>
+          <w:bCs w:val="0"/>
+          <w:color w:val="auto"/>
+          <w:sz w:val="20"/>
+          <w:szCs w:val="20"/>
+          <w:u w:val="none"/>
+          <w:lang w:val="en-US"/>
+        </w:rPr>
+      </w:pPr>
+    </w:p>
+    <w:p>
+      <w:pPr>
+        <w:spacing w:after="0" w:line="240" w:lineRule="auto"/>
+        <w:rPr>
+          <w:rFonts w:hint="default" w:ascii="Kalinga" w:hAnsi="Kalinga"/>
+          <w:b w:val="0"/>
+          <w:bCs w:val="0"/>
+          <w:color w:val="auto"/>
+          <w:sz w:val="20"/>
+          <w:szCs w:val="20"/>
+          <w:u w:val="none"/>
+          <w:lang w:val="en-US"/>
+        </w:rPr>
+      </w:pPr>
+      <w:r>
+        <w:rPr>
+          <w:rFonts w:hint="default" w:ascii="Kalinga" w:hAnsi="Kalinga"/>
+          <w:b w:val="0"/>
+          <w:bCs w:val="0"/>
+          <w:color w:val="auto"/>
+          <w:sz w:val="20"/>
+          <w:szCs w:val="20"/>
+          <w:u w:val="none"/>
+          <w:lang w:val="en-US"/>
+        </w:rPr>
+        <w:t xml:space="preserve">Total Angsuran Calon Debitur                    </w:t>
+      </w:r>
+      <w:r>
+        <w:rPr>
+          <w:rFonts w:hint="default" w:ascii="Kalinga" w:hAnsi="Kalinga"/>
+          <w:b w:val="0"/>
+          <w:bCs w:val="0"/>
+          <w:color w:val="auto"/>
+          <w:sz w:val="20"/>
+          <w:szCs w:val="20"/>
+          <w:u w:val="none"/>
+          <w:lang w:val="en-US"/>
+        </w:rPr>
+        <w:tab/>
+        <w:t/>
+      </w:r>
+      <w:r>
+        <w:rPr>
+          <w:rFonts w:hint="default" w:ascii="Kalinga" w:hAnsi="Kalinga"/>
+          <w:b w:val="0"/>
+          <w:bCs w:val="0"/>
+          <w:color w:val="auto"/>
+          <w:sz w:val="20"/>
+          <w:szCs w:val="20"/>
+          <w:u w:val="none"/>
+          <w:lang w:val="en-US"/>
+        </w:rPr>
+        <w:tab/>
+        <w:t xml:space="preserve">  : {{aktif_total_angsuran_calon_debitur}}</w:t>
+      </w:r>
+    </w:p>
+    <w:p>
+      <w:pPr>
+        <w:spacing w:after="0" w:line="240" w:lineRule="auto"/>
+        <w:rPr>
+          <w:rFonts w:hint="default" w:ascii="Kalinga" w:hAnsi="Kalinga"/>
+          <w:b w:val="0"/>
+          <w:bCs w:val="0"/>
+          <w:color w:val="auto"/>
+          <w:sz w:val="20"/>
+          <w:szCs w:val="20"/>
+          <w:u w:val="none"/>
+          <w:lang w:val="en-US"/>
+        </w:rPr>
+      </w:pPr>
+      <w:r>
+        <w:rPr>
+          <w:rFonts w:hint="default" w:ascii="Kalinga" w:hAnsi="Kalinga"/>
+          <w:b w:val="0"/>
+          <w:bCs w:val="0"/>
+          <w:color w:val="auto"/>
+          <w:sz w:val="20"/>
+          <w:szCs w:val="20"/>
+          <w:u w:val="none"/>
+          <w:lang w:val="en-US"/>
+        </w:rPr>
+        <w:t>Maksimal Angsuran Kredit yang dapat diberikan s.d</w:t>
+      </w:r>
+      <w:r>
+        <w:rPr>
+          <w:rFonts w:hint="default" w:ascii="Kalinga" w:hAnsi="Kalinga"/>
+          <w:b w:val="0"/>
+          <w:bCs w:val="0"/>
+          <w:color w:val="auto"/>
+          <w:sz w:val="20"/>
+          <w:szCs w:val="20"/>
+          <w:u w:val="none"/>
+          <w:lang w:val="en-US"/>
+        </w:rPr>
+        <w:tab/>
+        <w:t xml:space="preserve"> : {{aktif_maksimal_angsuran}}</w:t>
+      </w:r>
+    </w:p>
+    <w:p>
+      <w:pPr>
+        <w:spacing w:after="0" w:line="240" w:lineRule="auto"/>
+        <w:rPr>
+          <w:rFonts w:hint="default" w:ascii="Kalinga" w:hAnsi="Kalinga"/>
+          <w:b w:val="0"/>
+          <w:bCs w:val="0"/>
+          <w:color w:val="auto"/>
+          <w:sz w:val="20"/>
+          <w:szCs w:val="20"/>
+          <w:u w:val="none"/>
+          <w:lang w:val="en-US"/>
+        </w:rPr>
+      </w:pPr>
+      <w:r>
+        <w:rPr>
+          <w:rFonts w:hint="default" w:ascii="Kalinga" w:hAnsi="Kalinga"/>
+          <w:b w:val="0"/>
+          <w:bCs w:val="0"/>
+          <w:color w:val="auto"/>
+          <w:sz w:val="20"/>
+          <w:szCs w:val="20"/>
+          <w:u w:val="none"/>
+          <w:lang w:val="en-US"/>
+        </w:rPr>
+        <w:t xml:space="preserve">Angsuran Kredit yang dapat diusulkan              </w:t>
+      </w:r>
+      <w:r>
+        <w:rPr>
+          <w:rFonts w:hint="default" w:ascii="Kalinga" w:hAnsi="Kalinga"/>
+          <w:b w:val="0"/>
+          <w:bCs w:val="0"/>
+          <w:color w:val="auto"/>
+          <w:sz w:val="20"/>
+          <w:szCs w:val="20"/>
+          <w:u w:val="none"/>
+          <w:lang w:val="en-US"/>
+        </w:rPr>
+        <w:tab/>
+        <w:t/>
+      </w:r>
+      <w:r>
+        <w:rPr>
+          <w:rFonts w:hint="default" w:ascii="Kalinga" w:hAnsi="Kalinga"/>
+          <w:b w:val="0"/>
+          <w:bCs w:val="0"/>
+          <w:color w:val="auto"/>
+          <w:sz w:val="20"/>
+          <w:szCs w:val="20"/>
+          <w:u w:val="none"/>
+          <w:lang w:val="en-US"/>
+        </w:rPr>
+        <w:tab/>
+        <w:t>: {{aktif_angsuran_diusulkan}}</w:t>
+      </w:r>
+    </w:p>
+    <w:p>
+      <w:pPr>
+        <w:spacing w:after="0" w:line="240" w:lineRule="auto"/>
+        <w:rPr>
+          <w:rFonts w:hint="default" w:ascii="Kalinga" w:hAnsi="Kalinga"/>
+          <w:b w:val="0"/>
+          <w:bCs w:val="0"/>
+          <w:color w:val="auto"/>
+          <w:sz w:val="20"/>
+          <w:szCs w:val="20"/>
+          <w:u w:val="none"/>
+          <w:lang w:val="en-US"/>
+        </w:rPr>
+      </w:pPr>
+      <w:r>
+        <w:rPr>
+          <w:rFonts w:hint="default" w:ascii="Kalinga" w:hAnsi="Kalinga"/>
+          <w:b w:val="0"/>
+          <w:bCs w:val="0"/>
+          <w:color w:val="auto"/>
+          <w:sz w:val="20"/>
+          <w:szCs w:val="20"/>
+          <w:u w:val="none"/>
+          <w:lang w:val="en-US"/>
+        </w:rPr>
+        <w:t>Total Angsuran Kredit Eksisting &amp; Angsuran yg diusul : {{aktif_total_angsuran_all}}</w:t>
+      </w:r>
+    </w:p>
+    <w:p>
+      <w:pPr>
+        <w:spacing w:after="0" w:line="240" w:lineRule="auto"/>
+        <w:rPr>
+          <w:rFonts w:hint="default" w:ascii="Kalinga" w:hAnsi="Kalinga"/>
+          <w:b w:val="0"/>
+          <w:bCs w:val="0"/>
+          <w:color w:val="auto"/>
+          <w:sz w:val="20"/>
+          <w:szCs w:val="20"/>
+          <w:u w:val="none"/>
+          <w:lang w:val="en-US"/>
+        </w:rPr>
+      </w:pPr>
+      <w:r>
+        <w:rPr>
+          <w:rFonts w:hint="default" w:ascii="Kalinga" w:hAnsi="Kalinga"/>
+          <w:b w:val="0"/>
+          <w:bCs w:val="0"/>
+          <w:color w:val="auto"/>
+          <w:sz w:val="20"/>
+          <w:szCs w:val="20"/>
+          <w:u w:val="none"/>
+          <w:lang w:val="en-US"/>
+        </w:rPr>
+        <w:tab/>
+      </w:r>
+    </w:p>
+    <w:p>
+      <w:pPr>
+        <w:spacing w:after="0" w:line="240" w:lineRule="auto"/>
+        <w:rPr>
+          <w:rFonts w:hint="default" w:ascii="Kalinga" w:hAnsi="Kalinga"/>
+          <w:b w:val="0"/>
+          <w:bCs w:val="0"/>
+          <w:color w:val="auto"/>
+          <w:sz w:val="20"/>
+          <w:szCs w:val="20"/>
+          <w:u w:val="none"/>
+          <w:lang w:val="en-US"/>
+        </w:rPr>
+      </w:pPr>
+      <w:r>
+        <w:rPr>
+          <w:rFonts w:hint="default" w:ascii="Kalinga" w:hAnsi="Kalinga"/>
+          <w:b w:val="0"/>
+          <w:bCs w:val="0"/>
+          <w:color w:val="auto"/>
+          <w:sz w:val="20"/>
+          <w:szCs w:val="20"/>
+          <w:u w:val="none"/>
+          <w:lang w:val="en-US"/>
+        </w:rPr>
+        <w:t>DSR : {{aktif_dsr}}%</w:t>
+      </w:r>
+    </w:p>
+    <w:p>
+      <w:pPr>
+        <w:spacing w:after="0" w:line="240" w:lineRule="auto"/>
+        <w:rPr>
+          <w:rFonts w:ascii="Kalinga" w:hAnsi="Kalinga" w:cs="Kalinga"/>
+          <w:b w:val="0"/>
+          <w:bCs w:val="0"/>
+          <w:color w:val="auto"/>
+          <w:sz w:val="20"/>
+          <w:szCs w:val="20"/>
+          <w:u w:val="none"/>
+        </w:rPr>
+      </w:pPr>
+      <w:r>
+        <w:rPr>
+          <w:rFonts w:hint="default" w:ascii="Kalinga" w:hAnsi="Kalinga"/>
+          <w:b w:val="0"/>
+          <w:bCs w:val="0"/>
+          <w:color w:val="auto"/>
+          <w:sz w:val="20"/>
+          <w:szCs w:val="20"/>
+          <w:u w:val="none"/>
+          <w:lang w:val="en-US"/>
+        </w:rPr>
+        <w:t>{{aktif_dsr_keterangan}}</w:t>
+      </w:r>
+      <w:r>
+        <w:rPr>
+          <w:rFonts w:hint="default" w:ascii="Kalinga" w:hAnsi="Kalinga"/>
+          <w:b w:val="0"/>
+          <w:bCs w:val="0"/>
+          <w:color w:val="auto"/>
+          <w:sz w:val="20"/>
+          <w:szCs w:val="20"/>
+          <w:u w:val="none"/>
+          <w:lang w:val="en-US"/>
+        </w:rPr>
+        <w:tab/>
+      </w:r>
+      <w:r>
+        <w:rPr>
+          <w:rFonts w:hint="default" w:ascii="Kalinga" w:hAnsi="Kalinga"/>
+          <w:b w:val="0"/>
+          <w:bCs w:val="0"/>
+          <w:color w:val="auto"/>
+          <w:sz w:val="20"/>
+          <w:szCs w:val="20"/>
+          <w:u w:val="none"/>
+          <w:lang w:val="en-US"/>
+        </w:rPr>
+        <w:tab/>
+      </w:r>
+    </w:p>
+    <w:p>
+      <w:pPr>
+        <w:spacing w:after="0" w:line="240" w:lineRule="auto"/>
         <w:ind w:left="0" w:leftChars="0" w:firstLine="0" w:firstLineChars="0"/>
-        <w:jc w:val="both"/>
-        <w:rPr>
-          <w:rFonts w:hint="default" w:ascii="Kalinga" w:hAnsi="Kalinga"/>
-          <w:b w:val="0"/>
-          <w:bCs w:val="0"/>
-          <w:color w:val="auto"/>
-          <w:sz w:val="20"/>
-          <w:szCs w:val="20"/>
-        </w:rPr>
-      </w:pPr>
-    </w:p>
-    <w:p>
-      <w:pPr>
-        <w:numPr>
-          <w:ilvl w:val="0"/>
-          <w:numId w:val="0"/>
-        </w:numPr>
-        <w:spacing w:after="0" w:line="240" w:lineRule="auto"/>
-        <w:jc w:val="both"/>
-        <w:rPr>
-          <w:rFonts w:hint="default" w:ascii="Kalinga" w:hAnsi="Kalinga"/>
-          <w:color w:val="auto"/>
-          <w:sz w:val="20"/>
-          <w:szCs w:val="20"/>
-          <w:lang w:val="en-US"/>
-        </w:rPr>
-      </w:pPr>
-      <w:r>
-        <w:rPr>
-          <w:rFonts w:hint="default" w:ascii="Kalinga" w:hAnsi="Kalinga"/>
-          <w:b/>
-          <w:bCs/>
-          <w:color w:val="auto"/>
-          <w:sz w:val="20"/>
-          <w:szCs w:val="20"/>
-        </w:rPr>
-        <w:t>Total Angsuran Pemohon</w:t>
-      </w:r>
-      <w:r>
-        <w:rPr>
-          <w:rFonts w:hint="default" w:ascii="Kalinga" w:hAnsi="Kalinga"/>
-          <w:b/>
-          <w:bCs/>
-          <w:color w:val="auto"/>
-          <w:sz w:val="20"/>
-          <w:szCs w:val="20"/>
-          <w:lang w:val="en-US"/>
-        </w:rPr>
-        <w:tab/>
-      </w:r>
-      <w:r>
-        <w:rPr>
-          <w:rFonts w:hint="default" w:ascii="Kalinga" w:hAnsi="Kalinga"/>
-          <w:b/>
-          <w:bCs/>
-          <w:color w:val="auto"/>
-          <w:sz w:val="20"/>
-          <w:szCs w:val="20"/>
-          <w:lang w:val="en-US"/>
-        </w:rPr>
-        <w:tab/>
-      </w:r>
-      <w:r>
-        <w:rPr>
-          <w:rFonts w:hint="default" w:ascii="Kalinga" w:hAnsi="Kalinga"/>
-          <w:b/>
-          <w:bCs/>
-          <w:color w:val="auto"/>
-          <w:sz w:val="20"/>
-          <w:szCs w:val="20"/>
-          <w:lang w:val="en-US"/>
-        </w:rPr>
-        <w:tab/>
-      </w:r>
-      <w:r>
-        <w:rPr>
-          <w:rFonts w:hint="default" w:ascii="Kalinga" w:hAnsi="Kalinga"/>
-          <w:b/>
-          <w:bCs/>
-          <w:color w:val="auto"/>
-          <w:sz w:val="20"/>
-          <w:szCs w:val="20"/>
-        </w:rPr>
-        <w:t xml:space="preserve">: </w:t>
-      </w:r>
-      <w:r>
-        <w:rPr>
-          <w:rFonts w:hint="default" w:ascii="Kalinga" w:hAnsi="Kalinga"/>
-          <w:color w:val="auto"/>
-          <w:sz w:val="20"/>
-          <w:szCs w:val="20"/>
-        </w:rPr>
-        <w:tab/>
-      </w:r>
-      <w:r>
-        <w:rPr>
-          <w:rFonts w:hint="default" w:ascii="Kalinga" w:hAnsi="Kalinga"/>
-          <w:color w:val="auto"/>
-          <w:sz w:val="20"/>
-          <w:szCs w:val="20"/>
-        </w:rPr>
-        <w:t>Rp</w:t>
-      </w:r>
-      <w:r>
-        <w:rPr>
-          <w:rFonts w:hint="default" w:ascii="Kalinga" w:hAnsi="Kalinga"/>
-          <w:color w:val="auto"/>
-          <w:sz w:val="20"/>
-          <w:szCs w:val="20"/>
-          <w:lang w:val="en-US"/>
-        </w:rPr>
-        <w:t xml:space="preserve">. </w:t>
-      </w:r>
-      <w:r>
-        <w:rPr>
-          <w:rFonts w:hint="default" w:ascii="Kalinga" w:hAnsi="Kalinga"/>
-          <w:color w:val="auto"/>
-          <w:sz w:val="20"/>
-          <w:szCs w:val="20"/>
-        </w:rPr>
-        <w:t>{{rpc_total_angsuran_eksisting}}</w:t>
-      </w:r>
-      <w:r>
-        <w:rPr>
-          <w:rFonts w:hint="default" w:ascii="Kalinga" w:hAnsi="Kalinga"/>
-          <w:color w:val="auto"/>
-          <w:sz w:val="20"/>
-          <w:szCs w:val="20"/>
-          <w:lang w:val="en-US"/>
-        </w:rPr>
-        <w:t>,-</w:t>
-      </w:r>
-    </w:p>
-    <w:p>
-      <w:pPr>
-        <w:numPr>
-          <w:ilvl w:val="0"/>
-          <w:numId w:val="0"/>
-        </w:numPr>
-        <w:spacing w:after="0" w:line="240" w:lineRule="auto"/>
-        <w:jc w:val="both"/>
-        <w:rPr>
-          <w:rFonts w:hint="default" w:ascii="Kalinga" w:hAnsi="Kalinga"/>
-          <w:color w:val="auto"/>
-          <w:sz w:val="20"/>
-          <w:szCs w:val="20"/>
-        </w:rPr>
-      </w:pPr>
-    </w:p>
-    <w:p>
-      <w:pPr>
-        <w:numPr>
-          <w:ilvl w:val="0"/>
-          <w:numId w:val="0"/>
-        </w:numPr>
-        <w:spacing w:after="0" w:line="240" w:lineRule="auto"/>
-        <w:jc w:val="both"/>
-        <w:rPr>
-          <w:rFonts w:hint="default" w:ascii="Kalinga" w:hAnsi="Kalinga"/>
-          <w:color w:val="auto"/>
-          <w:sz w:val="20"/>
-          <w:szCs w:val="20"/>
-          <w:lang w:val="en-US"/>
-        </w:rPr>
-      </w:pPr>
-      <w:r>
-        <w:rPr>
-          <w:rFonts w:hint="default" w:ascii="Kalinga" w:hAnsi="Kalinga"/>
-          <w:b/>
-          <w:bCs/>
-          <w:color w:val="auto"/>
-          <w:sz w:val="20"/>
-          <w:szCs w:val="20"/>
-        </w:rPr>
-        <w:t xml:space="preserve">Maksimal Angsuran Kredit yang dapat diberikan sampai dengan : </w:t>
-      </w:r>
-      <w:r>
-        <w:rPr>
-          <w:rFonts w:hint="default" w:ascii="Kalinga" w:hAnsi="Kalinga"/>
-          <w:color w:val="auto"/>
-          <w:sz w:val="20"/>
-          <w:szCs w:val="20"/>
-        </w:rPr>
-        <w:tab/>
-      </w:r>
-      <w:r>
-        <w:rPr>
-          <w:rFonts w:hint="default" w:ascii="Kalinga" w:hAnsi="Kalinga"/>
-          <w:color w:val="auto"/>
-          <w:sz w:val="20"/>
-          <w:szCs w:val="20"/>
-        </w:rPr>
-        <w:t>Rp</w:t>
-      </w:r>
-      <w:r>
-        <w:rPr>
-          <w:rFonts w:hint="default" w:ascii="Kalinga" w:hAnsi="Kalinga"/>
-          <w:color w:val="auto"/>
-          <w:sz w:val="20"/>
-          <w:szCs w:val="20"/>
-          <w:lang w:val="en-US"/>
-        </w:rPr>
-        <w:t xml:space="preserve">. </w:t>
-      </w:r>
-      <w:r>
-        <w:rPr>
-          <w:rFonts w:hint="default" w:ascii="Kalinga" w:hAnsi="Kalinga"/>
-          <w:color w:val="auto"/>
-          <w:sz w:val="20"/>
-          <w:szCs w:val="20"/>
-        </w:rPr>
-        <w:t>{{rpc_maksimal_angsuran}}</w:t>
-      </w:r>
-      <w:r>
-        <w:rPr>
-          <w:rFonts w:hint="default" w:ascii="Kalinga" w:hAnsi="Kalinga"/>
-          <w:color w:val="auto"/>
-          <w:sz w:val="20"/>
-          <w:szCs w:val="20"/>
-          <w:lang w:val="en-US"/>
-        </w:rPr>
-        <w:t>,-</w:t>
-      </w:r>
-    </w:p>
-    <w:p>
-      <w:pPr>
-        <w:numPr>
-          <w:ilvl w:val="0"/>
-          <w:numId w:val="0"/>
-        </w:numPr>
-        <w:spacing w:after="0" w:line="240" w:lineRule="auto"/>
-        <w:jc w:val="both"/>
-        <w:rPr>
-          <w:rFonts w:hint="default" w:ascii="Kalinga" w:hAnsi="Kalinga"/>
-          <w:color w:val="auto"/>
-          <w:sz w:val="20"/>
-          <w:szCs w:val="20"/>
-          <w:lang w:val="en-US"/>
-        </w:rPr>
-      </w:pPr>
-      <w:r>
-        <w:rPr>
-          <w:rFonts w:hint="default" w:ascii="Kalinga" w:hAnsi="Kalinga"/>
-          <w:b/>
-          <w:bCs/>
-          <w:color w:val="auto"/>
-          <w:sz w:val="20"/>
-          <w:szCs w:val="20"/>
-        </w:rPr>
-        <w:t xml:space="preserve">Angsuran Kredit yang dapat diusulkan       </w:t>
-      </w:r>
-      <w:r>
-        <w:rPr>
-          <w:rFonts w:hint="default" w:ascii="Kalinga" w:hAnsi="Kalinga"/>
-          <w:b/>
-          <w:bCs/>
-          <w:color w:val="auto"/>
-          <w:sz w:val="20"/>
-          <w:szCs w:val="20"/>
-          <w:lang w:val="en-US"/>
-        </w:rPr>
-        <w:tab/>
-      </w:r>
-      <w:r>
-        <w:rPr>
-          <w:rFonts w:hint="default" w:ascii="Kalinga" w:hAnsi="Kalinga"/>
-          <w:b/>
-          <w:bCs/>
-          <w:color w:val="auto"/>
-          <w:sz w:val="20"/>
-          <w:szCs w:val="20"/>
-          <w:lang w:val="en-US"/>
-        </w:rPr>
-        <w:tab/>
-      </w:r>
-      <w:r>
-        <w:rPr>
-          <w:rFonts w:hint="default" w:ascii="Kalinga" w:hAnsi="Kalinga"/>
-          <w:b/>
-          <w:bCs/>
-          <w:color w:val="auto"/>
-          <w:sz w:val="20"/>
-          <w:szCs w:val="20"/>
-          <w:lang w:val="en-US"/>
-        </w:rPr>
-        <w:tab/>
-      </w:r>
-      <w:r>
-        <w:rPr>
-          <w:rFonts w:hint="default" w:ascii="Kalinga" w:hAnsi="Kalinga"/>
-          <w:b/>
-          <w:bCs/>
-          <w:color w:val="auto"/>
-          <w:sz w:val="20"/>
-          <w:szCs w:val="20"/>
-        </w:rPr>
-        <w:t xml:space="preserve">: </w:t>
-      </w:r>
-      <w:r>
-        <w:rPr>
-          <w:rFonts w:hint="default" w:ascii="Kalinga" w:hAnsi="Kalinga"/>
-          <w:color w:val="auto"/>
-          <w:sz w:val="20"/>
-          <w:szCs w:val="20"/>
-        </w:rPr>
-        <w:tab/>
-      </w:r>
-      <w:r>
-        <w:rPr>
-          <w:rFonts w:hint="default" w:ascii="Kalinga" w:hAnsi="Kalinga"/>
-          <w:color w:val="auto"/>
-          <w:sz w:val="20"/>
-          <w:szCs w:val="20"/>
-        </w:rPr>
-        <w:t>Rp</w:t>
-      </w:r>
-      <w:r>
-        <w:rPr>
-          <w:rFonts w:hint="default" w:ascii="Kalinga" w:hAnsi="Kalinga"/>
-          <w:color w:val="auto"/>
-          <w:sz w:val="20"/>
-          <w:szCs w:val="20"/>
-          <w:lang w:val="en-US"/>
-        </w:rPr>
-        <w:t xml:space="preserve">. </w:t>
-      </w:r>
-      <w:r>
-        <w:rPr>
-          <w:rFonts w:hint="default" w:ascii="Kalinga" w:hAnsi="Kalinga"/>
-          <w:color w:val="auto"/>
-          <w:sz w:val="20"/>
-          <w:szCs w:val="20"/>
-        </w:rPr>
-        <w:t>{{rpc_angsuran_diusulkan}}</w:t>
-      </w:r>
-      <w:r>
-        <w:rPr>
-          <w:rFonts w:hint="default" w:ascii="Kalinga" w:hAnsi="Kalinga"/>
-          <w:color w:val="auto"/>
-          <w:sz w:val="20"/>
-          <w:szCs w:val="20"/>
-          <w:lang w:val="en-US"/>
-        </w:rPr>
-        <w:t>,-</w:t>
-      </w:r>
-    </w:p>
-    <w:p>
-      <w:pPr>
-        <w:numPr>
-          <w:ilvl w:val="0"/>
-          <w:numId w:val="0"/>
-        </w:numPr>
-        <w:spacing w:after="0" w:line="240" w:lineRule="auto"/>
-        <w:jc w:val="both"/>
-        <w:rPr>
-          <w:rFonts w:hint="default" w:ascii="Kalinga" w:hAnsi="Kalinga"/>
-          <w:color w:val="auto"/>
-          <w:sz w:val="20"/>
-          <w:szCs w:val="20"/>
-          <w:lang w:val="en-US"/>
-        </w:rPr>
-      </w:pPr>
-      <w:r>
-        <w:rPr>
-          <w:rFonts w:hint="default" w:ascii="Kalinga" w:hAnsi="Kalinga"/>
-          <w:b/>
-          <w:bCs/>
-          <w:color w:val="auto"/>
-          <w:sz w:val="20"/>
-          <w:szCs w:val="20"/>
-        </w:rPr>
-        <w:t xml:space="preserve">Total Angsuran Kredit Eksisting &amp; Angsuran yang diusul   </w:t>
-      </w:r>
-      <w:r>
-        <w:rPr>
-          <w:rFonts w:hint="default" w:ascii="Kalinga" w:hAnsi="Kalinga"/>
-          <w:b/>
-          <w:bCs/>
-          <w:color w:val="auto"/>
-          <w:sz w:val="20"/>
-          <w:szCs w:val="20"/>
-          <w:lang w:val="en-US"/>
-        </w:rPr>
-        <w:tab/>
-      </w:r>
-      <w:r>
-        <w:rPr>
-          <w:rFonts w:hint="default" w:ascii="Kalinga" w:hAnsi="Kalinga"/>
-          <w:b/>
-          <w:bCs/>
-          <w:color w:val="auto"/>
-          <w:sz w:val="20"/>
-          <w:szCs w:val="20"/>
-        </w:rPr>
-        <w:t xml:space="preserve">: </w:t>
-      </w:r>
-      <w:r>
-        <w:rPr>
-          <w:rFonts w:hint="default" w:ascii="Kalinga" w:hAnsi="Kalinga"/>
-          <w:color w:val="auto"/>
-          <w:sz w:val="20"/>
-          <w:szCs w:val="20"/>
-        </w:rPr>
-        <w:tab/>
-      </w:r>
-      <w:r>
-        <w:rPr>
-          <w:rFonts w:hint="default" w:ascii="Kalinga" w:hAnsi="Kalinga"/>
-          <w:color w:val="auto"/>
-          <w:sz w:val="20"/>
-          <w:szCs w:val="20"/>
-        </w:rPr>
-        <w:t>Rp</w:t>
-      </w:r>
-      <w:r>
-        <w:rPr>
-          <w:rFonts w:hint="default" w:ascii="Kalinga" w:hAnsi="Kalinga"/>
-          <w:color w:val="auto"/>
-          <w:sz w:val="20"/>
-          <w:szCs w:val="20"/>
-          <w:lang w:val="en-US"/>
-        </w:rPr>
-        <w:t xml:space="preserve">. </w:t>
-      </w:r>
-      <w:r>
-        <w:rPr>
-          <w:rFonts w:hint="default" w:ascii="Kalinga" w:hAnsi="Kalinga"/>
-          <w:color w:val="auto"/>
-          <w:sz w:val="20"/>
-          <w:szCs w:val="20"/>
-        </w:rPr>
-        <w:t>{{rpc_total_angsuran_baru}}</w:t>
-      </w:r>
-      <w:r>
-        <w:rPr>
-          <w:rFonts w:hint="default" w:ascii="Kalinga" w:hAnsi="Kalinga"/>
-          <w:color w:val="auto"/>
-          <w:sz w:val="20"/>
-          <w:szCs w:val="20"/>
-          <w:lang w:val="en-US"/>
-        </w:rPr>
-        <w:t>,-</w:t>
-      </w:r>
-    </w:p>
-    <w:p>
-      <w:pPr>
-        <w:numPr>
-          <w:ilvl w:val="0"/>
-          <w:numId w:val="0"/>
-        </w:numPr>
-        <w:spacing w:after="0" w:line="240" w:lineRule="auto"/>
-        <w:jc w:val="both"/>
-        <w:rPr>
-          <w:rFonts w:hint="default" w:ascii="Kalinga" w:hAnsi="Kalinga"/>
-          <w:color w:val="auto"/>
-          <w:sz w:val="20"/>
-          <w:szCs w:val="20"/>
-        </w:rPr>
-      </w:pPr>
-    </w:p>
-    <w:p>
-      <w:pPr>
-        <w:numPr>
-          <w:ilvl w:val="0"/>
-          <w:numId w:val="0"/>
-        </w:numPr>
-        <w:spacing w:after="0" w:line="240" w:lineRule="auto"/>
-        <w:jc w:val="both"/>
-        <w:rPr>
-          <w:rFonts w:hint="default" w:ascii="Kalinga" w:hAnsi="Kalinga"/>
-          <w:color w:val="auto"/>
-          <w:sz w:val="20"/>
-          <w:szCs w:val="20"/>
-        </w:rPr>
-      </w:pPr>
-      <w:r>
-        <w:rPr>
-          <w:rFonts w:hint="default" w:ascii="Kalinga" w:hAnsi="Kalinga"/>
-          <w:b/>
-          <w:bCs/>
-          <w:color w:val="auto"/>
-          <w:sz w:val="20"/>
-          <w:szCs w:val="20"/>
-        </w:rPr>
-        <w:t xml:space="preserve">DSR  : </w:t>
-      </w:r>
-      <w:r>
-        <w:rPr>
-          <w:rFonts w:hint="default" w:ascii="Kalinga" w:hAnsi="Kalinga"/>
-          <w:b/>
-          <w:bCs/>
-          <w:color w:val="auto"/>
-          <w:sz w:val="20"/>
-          <w:szCs w:val="20"/>
-        </w:rPr>
-        <w:tab/>
-      </w:r>
-      <w:r>
-        <w:rPr>
-          <w:rFonts w:hint="default" w:ascii="Kalinga" w:hAnsi="Kalinga"/>
-          <w:b/>
-          <w:bCs/>
-          <w:color w:val="auto"/>
-          <w:sz w:val="20"/>
-          <w:szCs w:val="20"/>
-        </w:rPr>
-        <w:t>{{rpc_dsr}}%</w:t>
-      </w:r>
-    </w:p>
-    <w:p>
-      <w:pPr>
-        <w:spacing w:after="0" w:line="240" w:lineRule="auto"/>
         <w:rPr>
           <w:rFonts w:ascii="Kalinga" w:hAnsi="Kalinga" w:cs="Kalinga"/>
           <w:b/>
@@ -2725,22 +3576,36 @@
           <w:szCs w:val="20"/>
         </w:rPr>
       </w:pPr>
-      <w:r>
-        <w:rPr>
-          <w:rFonts w:hint="default" w:ascii="Kalinga" w:hAnsi="Kalinga"/>
-          <w:i/>
-          <w:iCs/>
+    </w:p>
+    <w:p>
+      <w:pPr>
+        <w:spacing w:after="0" w:line="240" w:lineRule="auto"/>
+        <w:ind w:left="0" w:leftChars="0" w:firstLine="0" w:firstLineChars="0"/>
+        <w:rPr>
+          <w:rFonts w:ascii="Kalinga" w:hAnsi="Kalinga" w:cs="Kalinga"/>
+          <w:b/>
+          <w:bCs/>
+          <w:color w:val="auto"/>
+          <w:sz w:val="20"/>
+          <w:szCs w:val="20"/>
+        </w:rPr>
+      </w:pPr>
+    </w:p>
+    <w:p>
+      <w:pPr>
+        <w:spacing w:after="0" w:line="240" w:lineRule="auto"/>
+        <w:ind w:left="0" w:leftChars="0" w:firstLine="0" w:firstLineChars="0"/>
+        <w:rPr>
+          <w:rFonts w:ascii="Kalinga" w:hAnsi="Kalinga" w:cs="Kalinga"/>
+          <w:b/>
+          <w:bCs/>
           <w:color w:val="auto"/>
           <w:sz w:val="20"/>
           <w:szCs w:val="20"/>
           <w:u w:val="single"/>
         </w:rPr>
-        <w:t>Penghasilan per bulan &lt; atau sama dengan Rp. 20 juta, maksimal DSR = 90% (Cfm. Memo PDM/9.3/5176 Tanggal 01-10-2019)</w:t>
-      </w:r>
-    </w:p>
-    <w:p>
-      <w:pPr>
-        <w:spacing w:after="0" w:line="240" w:lineRule="auto"/>
+      </w:pPr>
+      <w:r>
         <w:rPr>
           <w:rFonts w:ascii="Kalinga" w:hAnsi="Kalinga" w:cs="Kalinga"/>
           <w:b/>
@@ -2748,30 +3613,7 @@
           <w:color w:val="auto"/>
           <w:sz w:val="20"/>
           <w:szCs w:val="20"/>
-        </w:rPr>
-      </w:pPr>
-    </w:p>
-    <w:p>
-      <w:pPr>
-        <w:spacing w:after="0" w:line="240" w:lineRule="auto"/>
-        <w:ind w:left="0" w:leftChars="0" w:firstLine="0" w:firstLineChars="0"/>
-        <w:rPr>
-          <w:rFonts w:ascii="Kalinga" w:hAnsi="Kalinga" w:cs="Kalinga"/>
-          <w:b/>
-          <w:bCs/>
-          <w:color w:val="auto"/>
-          <w:sz w:val="20"/>
-          <w:szCs w:val="20"/>
-        </w:rPr>
-      </w:pPr>
-      <w:r>
-        <w:rPr>
-          <w:rFonts w:ascii="Kalinga" w:hAnsi="Kalinga" w:cs="Kalinga"/>
-          <w:b/>
-          <w:bCs/>
-          <w:color w:val="auto"/>
-          <w:sz w:val="20"/>
-          <w:szCs w:val="20"/>
+          <w:u w:val="single"/>
         </w:rPr>
         <w:t>USULAN ASISTEN KREDIT KONSUMER</w:t>
       </w:r>
@@ -2780,8 +3622,7 @@
     <w:bookmarkEnd w:id="1"/>
     <w:p>
       <w:pPr>
-        <w:spacing w:after="0" w:line="240" w:lineRule="auto"/>
-        <w:ind w:left="0" w:leftChars="0" w:firstLine="0" w:firstLineChars="0"/>
+        <w:spacing w:line="240" w:lineRule="auto"/>
         <w:jc w:val="both"/>
         <w:rPr>
           <w:rFonts w:ascii="Kalinga" w:hAnsi="Kalinga" w:cs="Kalinga"/>
@@ -2792,39 +3633,25 @@
           <w:szCs w:val="20"/>
         </w:rPr>
       </w:pPr>
-      <w:bookmarkStart w:id="3" w:name="OLE_LINK19"/>
-      <w:bookmarkStart w:id="4" w:name="OLE_LINK8"/>
-      <w:bookmarkStart w:id="5" w:name="OLE_LINK17"/>
-      <w:bookmarkStart w:id="6" w:name="OLE_LINK41"/>
-      <w:bookmarkStart w:id="7" w:name="OLE_LINK27"/>
-      <w:bookmarkStart w:id="8" w:name="OLE_LINK3"/>
-      <w:bookmarkStart w:id="9" w:name="OLE_LINK32"/>
-      <w:bookmarkStart w:id="10" w:name="OLE_LINK23"/>
-      <w:bookmarkStart w:id="11" w:name="OLE_LINK24"/>
-      <w:bookmarkStart w:id="12" w:name="OLE_LINK10"/>
-      <w:bookmarkStart w:id="13" w:name="OLE_LINK33"/>
+      <w:bookmarkStart w:id="6" w:name="OLE_LINK8"/>
+      <w:bookmarkStart w:id="7" w:name="OLE_LINK17"/>
+      <w:bookmarkStart w:id="8" w:name="OLE_LINK24"/>
+      <w:bookmarkStart w:id="9" w:name="OLE_LINK10"/>
+      <w:bookmarkStart w:id="10" w:name="OLE_LINK33"/>
+      <w:bookmarkStart w:id="11" w:name="OLE_LINK23"/>
+      <w:bookmarkStart w:id="12" w:name="OLE_LINK3"/>
+      <w:bookmarkStart w:id="13" w:name="OLE_LINK27"/>
+      <w:bookmarkStart w:id="14" w:name="OLE_LINK41"/>
+      <w:bookmarkStart w:id="15" w:name="OLE_LINK32"/>
       <w:r>
         <w:rPr>
           <w:rFonts w:ascii="Kalinga" w:hAnsi="Kalinga" w:cs="Kalinga"/>
           <w:b/>
           <w:bCs/>
-          <w:color w:val="auto"/>
-          <w:sz w:val="20"/>
-          <w:szCs w:val="20"/>
-        </w:rPr>
-        <w:t>Repayment Capacity dapat mengcover angsuran yang akan diberikan, DSR sebesar</w:t>
-      </w:r>
-      <w:r>
-        <w:rPr>
-          <w:rFonts w:hint="default" w:ascii="Kalinga" w:hAnsi="Kalinga" w:cs="Kalinga"/>
-          <w:b/>
-          <w:bCs/>
-          <w:color w:val="auto"/>
-          <w:sz w:val="20"/>
-          <w:szCs w:val="20"/>
-          <w:lang w:val="en-US"/>
-        </w:rPr>
-        <w:t xml:space="preserve"> </w:t>
+          <w:sz w:val="20"/>
+          <w:szCs w:val="20"/>
+        </w:rPr>
+        <w:t xml:space="preserve">Repayment Capacity dapat mengcover angsuran yang akan diberikan, DSR sebesar : </w:t>
       </w:r>
       <w:r>
         <w:rPr>
@@ -2850,113 +3677,36 @@
       </w:r>
       <w:r>
         <w:rPr>
-          <w:rFonts w:hint="default" w:ascii="Kalinga" w:hAnsi="Kalinga" w:cs="Kalinga"/>
-          <w:b/>
-          <w:bCs/>
-          <w:color w:val="auto"/>
-          <w:sz w:val="20"/>
-          <w:szCs w:val="20"/>
-          <w:lang w:val="en-US"/>
-        </w:rPr>
-        <w:t xml:space="preserve"> </w:t>
-      </w:r>
-      <w:r>
-        <w:rPr>
           <w:rFonts w:ascii="Kalinga" w:hAnsi="Kalinga" w:cs="Kalinga"/>
           <w:b/>
           <w:bCs/>
-          <w:color w:val="auto"/>
-          <w:sz w:val="20"/>
-          <w:szCs w:val="20"/>
-        </w:rPr>
-        <w:t xml:space="preserve">Penghasilan per bulan &gt; atau sama dengan Rp. 20 juta, Maksimal DSR = 90% (Cfm. Memo PDM/9.3/5176 Tanggal 01-10-2019). Hasil </w:t>
+          <w:sz w:val="20"/>
+          <w:szCs w:val="20"/>
+        </w:rPr>
+        <w:t xml:space="preserve"> Penghasilan per bulan &lt; atau sama dengan Rp. 20 juta, maksimal DSR = 60%. Hasil scoring accept, RPC mencukupi, Permohonan Kredit Pemohon dalam Program </w:t>
+      </w:r>
+      <w:r>
+        <w:rPr>
+          <w:rFonts w:hint="default" w:ascii="Kalinga" w:hAnsi="Kalinga" w:eastAsia="SimSun"/>
+          <w:b/>
+          <w:bCs/>
+          <w:color w:val="auto"/>
+          <w:sz w:val="20"/>
+          <w:szCs w:val="20"/>
+          <w:lang w:val="en-US"/>
+        </w:rPr>
+        <w:t>{{kode_program}}</w:t>
       </w:r>
       <w:r>
         <w:rPr>
           <w:rFonts w:ascii="Kalinga" w:hAnsi="Kalinga" w:cs="Kalinga"/>
           <w:b/>
           <w:bCs/>
-          <w:i/>
-          <w:iCs/>
-          <w:color w:val="auto"/>
-          <w:sz w:val="20"/>
-          <w:szCs w:val="20"/>
-        </w:rPr>
-        <w:t>scoring accept,</w:t>
-      </w:r>
-      <w:r>
-        <w:rPr>
-          <w:rFonts w:ascii="Kalinga" w:hAnsi="Kalinga" w:cs="Kalinga"/>
-          <w:b/>
-          <w:bCs/>
-          <w:color w:val="auto"/>
-          <w:sz w:val="20"/>
-          <w:szCs w:val="20"/>
-        </w:rPr>
-        <w:t xml:space="preserve"> RPC mencukupi. Permohonan Kredit </w:t>
-      </w:r>
-      <w:r>
-        <w:rPr>
-          <w:rFonts w:ascii="Kalinga" w:hAnsi="Kalinga" w:eastAsia="SimSun" w:cs="Kalinga"/>
-          <w:b/>
-          <w:bCs/>
-          <w:color w:val="auto"/>
-          <w:sz w:val="20"/>
-          <w:szCs w:val="20"/>
-        </w:rPr>
-        <w:t>Program</w:t>
-      </w:r>
-      <w:r>
-        <w:rPr>
-          <w:rFonts w:hint="default" w:ascii="Kalinga" w:hAnsi="Kalinga" w:eastAsia="SimSun" w:cs="Kalinga"/>
-          <w:b/>
-          <w:bCs/>
-          <w:color w:val="auto"/>
-          <w:sz w:val="20"/>
-          <w:szCs w:val="20"/>
-          <w:lang w:val="en-US"/>
-        </w:rPr>
-        <w:t xml:space="preserve"> </w:t>
-      </w:r>
-      <w:r>
-        <w:rPr>
-          <w:rFonts w:hint="default" w:ascii="Kalinga" w:hAnsi="Kalinga" w:eastAsia="SimSun"/>
-          <w:b/>
-          <w:bCs/>
-          <w:color w:val="auto"/>
-          <w:sz w:val="20"/>
-          <w:szCs w:val="20"/>
-          <w:lang w:val="en-US"/>
-        </w:rPr>
-        <w:t>{{kode_program}}</w:t>
-      </w:r>
-      <w:r>
-        <w:rPr>
-          <w:rFonts w:ascii="Kalinga" w:hAnsi="Kalinga" w:cs="Kalinga"/>
-          <w:b/>
-          <w:bCs/>
-          <w:color w:val="auto"/>
           <w:sz w:val="20"/>
           <w:szCs w:val="20"/>
         </w:rPr>
         <w:t>, dapat diusulkan sebagai berikut :</w:t>
       </w:r>
-      <w:bookmarkEnd w:id="3"/>
-    </w:p>
-    <w:p>
-      <w:pPr>
-        <w:spacing w:after="0" w:line="240" w:lineRule="auto"/>
-        <w:ind w:left="0" w:leftChars="0" w:firstLine="0" w:firstLineChars="0"/>
-        <w:jc w:val="both"/>
-        <w:rPr>
-          <w:rFonts w:ascii="Kalinga" w:hAnsi="Kalinga" w:cs="Kalinga"/>
-          <w:b/>
-          <w:bCs/>
-          <w:color w:val="auto"/>
-          <w:sz w:val="20"/>
-          <w:szCs w:val="20"/>
-        </w:rPr>
-      </w:pPr>
     </w:p>
     <w:p>
       <w:pPr>
@@ -3197,10 +3947,10 @@
         </w:rPr>
         <w:t>Syarat Penandatanganan :</w:t>
       </w:r>
-      <w:bookmarkEnd w:id="4"/>
-      <w:bookmarkEnd w:id="5"/>
-      <w:bookmarkStart w:id="14" w:name="OLE_LINK34"/>
-      <w:bookmarkStart w:id="15" w:name="OLE_LINK16"/>
+      <w:bookmarkEnd w:id="6"/>
+      <w:bookmarkEnd w:id="7"/>
+      <w:bookmarkStart w:id="16" w:name="OLE_LINK34"/>
+      <w:bookmarkStart w:id="17" w:name="OLE_LINK16"/>
       <w:r>
         <w:rPr>
           <w:rFonts w:hint="default" w:ascii="Kalinga" w:hAnsi="Kalinga"/>
@@ -3251,8 +4001,6 @@
         </w:rPr>
       </w:pPr>
     </w:p>
-    <w:bookmarkEnd w:id="6"/>
-    <w:bookmarkEnd w:id="7"/>
     <w:bookmarkEnd w:id="8"/>
     <w:bookmarkEnd w:id="9"/>
     <w:bookmarkEnd w:id="10"/>
@@ -3261,6 +4009,8 @@
     <w:bookmarkEnd w:id="13"/>
     <w:bookmarkEnd w:id="14"/>
     <w:bookmarkEnd w:id="15"/>
+    <w:bookmarkEnd w:id="16"/>
+    <w:bookmarkEnd w:id="17"/>
     <w:p>
       <w:pPr>
         <w:spacing w:after="0" w:line="240" w:lineRule="auto"/>
@@ -3274,7 +4024,7 @@
           <w:szCs w:val="20"/>
         </w:rPr>
       </w:pPr>
-      <w:bookmarkStart w:id="16" w:name="OLE_LINK42"/>
+      <w:bookmarkStart w:id="18" w:name="OLE_LINK42"/>
       <w:r>
         <w:rPr>
           <w:rFonts w:ascii="Kalinga" w:hAnsi="Kalinga" w:cs="Kalinga"/>
@@ -3314,7 +4064,7 @@
         </w:rPr>
         <w:t>Pencairan Kredit BNI Fleksi Pensiun akan dilakukan dengan tahap sebagai berikut :</w:t>
       </w:r>
-      <w:bookmarkEnd w:id="16"/>
+      <w:bookmarkEnd w:id="18"/>
       <w:r>
         <w:rPr>
           <w:rFonts w:hint="default" w:ascii="Kalinga" w:hAnsi="Kalinga"/>
@@ -3343,8 +4093,6 @@
           <w:lang w:val="en-US"/>
         </w:rPr>
       </w:pPr>
-      <w:bookmarkStart w:id="17" w:name="_GoBack"/>
-      <w:bookmarkEnd w:id="17"/>
       <w:r>
         <w:rPr>
           <w:rFonts w:hint="default" w:ascii="Kalinga" w:hAnsi="Kalinga"/>

</xml_diff>